<commit_message>
test: complete animehacker TQ3 controlled retest
</commit_message>
<xml_diff>
--- a/docs/testing/workbooks/generated/03_animehacker_TQ3_0_Controlled_Retest_Workbook_v1.docx
+++ b/docs/testing/workbooks/generated/03_animehacker_TQ3_0_Controlled_Retest_Workbook_v1.docx
@@ -8,7 +8,7 @@
         <w:jc w:val="center"/>
       </w:pPr>
       <w:r>
-        <w:t>03 animehacker TQ3_0 Controlled Retest Workbook v1.2</w:t>
+        <w:t>03 animehacker TQ3_0 Controlled Retest Workbook v1.3</w:t>
       </w:r>
     </w:p>
     <w:p>
@@ -546,6 +546,137 @@
           <w:tcPr>
             <w:tcW w:type="dxa" w:w="2078"/>
             <w:vAlign w:val="center"/>
+          </w:tcPr>
+          <w:p>
+            <w:pPr>
+              <w:spacing w:after="0"/>
+            </w:pPr>
+            <w:r>
+              <w:rPr>
+                <w:sz w:val="14"/>
+              </w:rPr>
+              <w:t>Superseded</w:t>
+            </w:r>
+          </w:p>
+        </w:tc>
+      </w:tr>
+      <w:tr>
+        <w:trPr>
+          <w:cantSplit/>
+        </w:trPr>
+        <w:tc>
+          <w:tcPr>
+            <w:tcW w:type="dxa" w:w="2078"/>
+            <w:vAlign w:val="center"/>
+            <w:shd w:fill="EAF2F8"/>
+          </w:tcPr>
+          <w:p>
+            <w:pPr>
+              <w:spacing w:after="0"/>
+            </w:pPr>
+            <w:r>
+              <w:rPr>
+                <w:sz w:val="14"/>
+              </w:rPr>
+              <w:t>1.3</w:t>
+            </w:r>
+          </w:p>
+        </w:tc>
+        <w:tc>
+          <w:tcPr>
+            <w:tcW w:type="dxa" w:w="2078"/>
+            <w:vAlign w:val="center"/>
+            <w:shd w:fill="EAF2F8"/>
+          </w:tcPr>
+          <w:p>
+            <w:pPr>
+              <w:spacing w:after="0"/>
+            </w:pPr>
+            <w:r>
+              <w:rPr>
+                <w:sz w:val="14"/>
+              </w:rPr>
+              <w:t>2026-07-18</w:t>
+            </w:r>
+          </w:p>
+        </w:tc>
+        <w:tc>
+          <w:tcPr>
+            <w:tcW w:type="dxa" w:w="2078"/>
+            <w:vAlign w:val="center"/>
+            <w:shd w:fill="EAF2F8"/>
+          </w:tcPr>
+          <w:p>
+            <w:pPr>
+              <w:spacing w:after="0"/>
+            </w:pPr>
+            <w:r>
+              <w:rPr>
+                <w:sz w:val="14"/>
+              </w:rPr>
+              <w:t>Student</w:t>
+            </w:r>
+          </w:p>
+        </w:tc>
+        <w:tc>
+          <w:tcPr>
+            <w:tcW w:type="dxa" w:w="2078"/>
+            <w:vAlign w:val="center"/>
+            <w:shd w:fill="EAF2F8"/>
+          </w:tcPr>
+          <w:p>
+            <w:pPr>
+              <w:spacing w:after="0"/>
+            </w:pPr>
+            <w:r>
+              <w:rPr>
+                <w:sz w:val="14"/>
+              </w:rPr>
+              <w:t>Completed fresh CPU, SYCL and supplementary Vulkan builds; reconciled repository tests; measured six runnable rows with three formal samples and complete CPU/GPU/memory metrics; safety-classified two 8B rows; capability-classified two SYCL TQ3 rows; executed and harshly scored P1-P6 for every runnable configuration.</w:t>
+            </w:r>
+          </w:p>
+        </w:tc>
+        <w:tc>
+          <w:tcPr>
+            <w:tcW w:type="dxa" w:w="2078"/>
+            <w:vAlign w:val="center"/>
+            <w:shd w:fill="EAF2F8"/>
+          </w:tcPr>
+          <w:p>
+            <w:pPr>
+              <w:spacing w:after="0"/>
+            </w:pPr>
+            <w:r>
+              <w:rPr>
+                <w:sz w:val="14"/>
+              </w:rPr>
+              <w:t>AH-B01-AH-B08; AH-01-AH-10; P1-P6</w:t>
+            </w:r>
+          </w:p>
+        </w:tc>
+        <w:tc>
+          <w:tcPr>
+            <w:tcW w:type="dxa" w:w="2078"/>
+            <w:vAlign w:val="center"/>
+            <w:shd w:fill="EAF2F8"/>
+          </w:tcPr>
+          <w:p>
+            <w:pPr>
+              <w:spacing w:after="0"/>
+            </w:pPr>
+            <w:r>
+              <w:rPr>
+                <w:sz w:val="14"/>
+              </w:rPr>
+              <w:t>testing/animehacker-tq3-formal-retest; Pending PR; Pending merge</w:t>
+            </w:r>
+          </w:p>
+        </w:tc>
+        <w:tc>
+          <w:tcPr>
+            <w:tcW w:type="dxa" w:w="2078"/>
+            <w:vAlign w:val="center"/>
+            <w:shd w:fill="EAF2F8"/>
           </w:tcPr>
           <w:p>
             <w:pPr>
@@ -641,7 +772,7 @@
         <w:spacing w:after="60"/>
       </w:pPr>
       <w:r>
-        <w:t>Controlled retest template v1.2. Historical results were removed from this working copy; the original source document is preserved under docs/testing/source-material/original-workbooks/.</w:t>
+        <w:t>Controlled retest template v1.3. Historical results were removed from this working copy; the original source document is preserved under docs/testing/source-material/original-workbooks/.</w:t>
       </w:r>
     </w:p>
     <w:p>
@@ -794,6 +925,7 @@
               <w:rPr>
                 <w:sz w:val="14"/>
               </w:rPr>
+              <w:t>main (detached campaign pin; tag main-b8532-5bc5ed3)</w:t>
             </w:r>
           </w:p>
         </w:tc>
@@ -832,6 +964,7 @@
               <w:rPr>
                 <w:sz w:val="14"/>
               </w:rPr>
+              <w:t>5bc5ed3bdc25003aa9f07422753a7b8d4f9190fc</w:t>
             </w:r>
           </w:p>
         </w:tc>
@@ -872,6 +1005,7 @@
               <w:rPr>
                 <w:sz w:val="14"/>
               </w:rPr>
+              <w:t>914eb5ff0c74c88c7ef8aec115878d8f64c81e56</w:t>
             </w:r>
           </w:p>
         </w:tc>
@@ -910,6 +1044,7 @@
               <w:rPr>
                 <w:sz w:val="14"/>
               </w:rPr>
+              <w:t>TQ3_0, 14-byte blocks per 32 values (3.5 bits/value); repository history identifies implementation as 3-bit PolarQuant without QJL</w:t>
             </w:r>
           </w:p>
         </w:tc>
@@ -950,6 +1085,7 @@
               <w:rPr>
                 <w:sz w:val="14"/>
               </w:rPr>
+              <w:t>Fresh Windows MSVC/AVX2 build passed; 40/40 repository tests passed after test-only capability/threshold correction; AH-01-AH-05 runtime complete; 8B rows safety-classified</w:t>
             </w:r>
           </w:p>
         </w:tc>
@@ -988,6 +1124,7 @@
               <w:rPr>
                 <w:sz w:val="14"/>
               </w:rPr>
+              <w:t>Controlled SYCL OpenCL build and reconciled 40/40 terminal tests passed; standard partial runtime passed; TQ3 SYCL runtime disproven; supplementary Vulkan built but has no TQ3_0-specific source evidence</w:t>
             </w:r>
           </w:p>
         </w:tc>
@@ -1028,6 +1165,7 @@
               <w:rPr>
                 <w:sz w:val="14"/>
               </w:rPr>
+              <w:t>CUDA-specific implementation exists, but TQ3_0 is not source-level CUDA-only because CPU and SYCL paths are also present</w:t>
             </w:r>
           </w:p>
         </w:tc>
@@ -1066,6 +1204,7 @@
               <w:rPr>
                 <w:sz w:val="14"/>
               </w:rPr>
+              <w:t>No - not implemented; fork commit 4381bdde corrects the description to PolarQuant without QJL, and no executable QJL projection/correction path was found</w:t>
             </w:r>
           </w:p>
         </w:tc>
@@ -1106,6 +1245,7 @@
               <w:rPr>
                 <w:sz w:val="14"/>
               </w:rPr>
+              <w:t>Codex controlled retest agent</w:t>
             </w:r>
           </w:p>
         </w:tc>
@@ -1144,6 +1284,7 @@
               <w:rPr>
                 <w:sz w:val="14"/>
               </w:rPr>
+              <w:t>2026-07-18</w:t>
             </w:r>
           </w:p>
         </w:tc>
@@ -1184,6 +1325,7 @@
               <w:rPr>
                 <w:sz w:val="14"/>
               </w:rPr>
+              <w:t>2026-07-18</w:t>
             </w:r>
           </w:p>
         </w:tc>
@@ -1222,6 +1364,7 @@
               <w:rPr>
                 <w:sz w:val="14"/>
               </w:rPr>
+              <w:t>Complete: 6 runnable rows passed runtime/quality evidence collection; 2 rows safety-classified; 2 rows capability-classified; zero unresolved failures</w:t>
             </w:r>
           </w:p>
         </w:tc>
@@ -1360,6 +1503,7 @@
               <w:rPr>
                 <w:sz w:val="14"/>
               </w:rPr>
+              <w:t>Confirmed for 2026-07-18 campaign</w:t>
             </w:r>
           </w:p>
         </w:tc>
@@ -1418,6 +1562,7 @@
               <w:rPr>
                 <w:sz w:val="14"/>
               </w:rPr>
+              <w:t>Confirmed: 8 cores, 12 logical processors</w:t>
             </w:r>
           </w:p>
         </w:tc>
@@ -1473,6 +1618,7 @@
               <w:rPr>
                 <w:sz w:val="14"/>
               </w:rPr>
+              <w:t>Confirmed: 16,462,712 KiB visible at inventory</w:t>
             </w:r>
           </w:p>
         </w:tc>
@@ -1531,6 +1677,7 @@
               <w:rPr>
                 <w:sz w:val="14"/>
               </w:rPr>
+              <w:t>Confirmed: driver 32.0.101.7076; Level Zero and OpenCL GPU enumerated</w:t>
             </w:r>
           </w:p>
         </w:tc>
@@ -1586,6 +1733,7 @@
               <w:rPr>
                 <w:sz w:val="14"/>
               </w:rPr>
+              <w:t>Windows 11 Home 10.0.26200 build 26200</w:t>
             </w:r>
           </w:p>
         </w:tc>
@@ -1644,6 +1792,7 @@
               <w:rPr>
                 <w:sz w:val="14"/>
               </w:rPr>
+              <w:t>Confirmed excluded; no NPU route in controlled matrix</w:t>
             </w:r>
           </w:p>
         </w:tc>
@@ -1800,6 +1949,7 @@
               <w:rPr>
                 <w:sz w:val="14"/>
               </w:rPr>
+              <w:t>Passed</w:t>
             </w:r>
           </w:p>
         </w:tc>
@@ -1816,6 +1966,7 @@
               <w:rPr>
                 <w:sz w:val="14"/>
               </w:rPr>
+              <w:t>Clean detached checkout of latest default branch at campaign start; `experiments/raw-results/animehacker-tq3-0/2026-07-18/acquisition/repository.json`</w:t>
             </w:r>
           </w:p>
         </w:tc>
@@ -1874,6 +2025,7 @@
               <w:rPr>
                 <w:sz w:val="14"/>
               </w:rPr>
+              <w:t>Passed</w:t>
             </w:r>
           </w:p>
         </w:tc>
@@ -1891,6 +2043,7 @@
               <w:rPr>
                 <w:sz w:val="14"/>
               </w:rPr>
+              <w:t>CMake 4.4.0, Ninja 1.13.0, MSVC 19.51; fresh RelWithDebInfo tree completed 418/418 actions. `experiments/raw-results/animehacker-tq3-0/2026-07-18/build-cpu/`</w:t>
             </w:r>
           </w:p>
         </w:tc>
@@ -1946,6 +2099,7 @@
               <w:rPr>
                 <w:sz w:val="14"/>
               </w:rPr>
+              <w:t>Passed</w:t>
             </w:r>
           </w:p>
         </w:tc>
@@ -1962,6 +2116,7 @@
               <w:rPr>
                 <w:sz w:val="14"/>
               </w:rPr>
+              <w:t>AVX2/FMA/F16C CPU backend built; binary inventory and hashes in `build-cpu/reconciliation.json`</w:t>
             </w:r>
           </w:p>
         </w:tc>
@@ -2020,6 +2175,7 @@
               <w:rPr>
                 <w:sz w:val="14"/>
               </w:rPr>
+              <w:t>Passed</w:t>
             </w:r>
           </w:p>
         </w:tc>
@@ -2037,6 +2193,7 @@
               <w:rPr>
                 <w:sz w:val="14"/>
               </w:rPr>
+              <w:t>`llama-cli`, `llama-server`, `llama-bench`, `llama-quantize`, and `llama-perplexity` built and SHA-256 hashed in `build-cpu/reconciliation.json`</w:t>
             </w:r>
           </w:p>
         </w:tc>
@@ -2092,6 +2249,7 @@
               <w:rPr>
                 <w:sz w:val="14"/>
               </w:rPr>
+              <w:t>Passed - 40/40</w:t>
             </w:r>
           </w:p>
         </w:tc>
@@ -2108,6 +2266,7 @@
               <w:rPr>
                 <w:sz w:val="14"/>
               </w:rPr>
+              <w:t>Initial TQ3_0 test segfault traced to absent optional vec-dot trait; subsequent RMSE 0.003872 was below the unchanged 3-bit 0.0040 limit. Test-only patch recorded in `build-cpu/test-capability-guard.patch`; complete rerun in `build-cpu/ctest-final.log`</w:t>
             </w:r>
           </w:p>
         </w:tc>
@@ -2166,6 +2325,7 @@
               <w:rPr>
                 <w:sz w:val="14"/>
               </w:rPr>
+              <w:t>Passed with limitations</w:t>
             </w:r>
           </w:p>
         </w:tc>
@@ -2183,6 +2343,7 @@
               <w:rPr>
                 <w:sz w:val="14"/>
               </w:rPr>
+              <w:t>SYCL OpenCL device inventory succeeded; reconciled 40/40 terminal tests passed. Standard runtime offloaded 1/41 layers. TQ3 attention offload is runtime-unsupported. Supplementary Vulkan device exists but TQ3 is not source-proven. `experiments/raw-results/animehacker-tq3-0/2026-07-18/build-sycl/reconciliation.json`; `build-vulkan/reconciliation.json`</w:t>
             </w:r>
           </w:p>
         </w:tc>
@@ -2238,6 +2399,7 @@
               <w:rPr>
                 <w:sz w:val="14"/>
               </w:rPr>
+              <w:t>Not used - Windows CPU and controlled SYCL evidence were sufficient</w:t>
             </w:r>
           </w:p>
         </w:tc>
@@ -2254,6 +2416,7 @@
               <w:rPr>
                 <w:sz w:val="14"/>
               </w:rPr>
+              <w:t>WSL would not change the Intel Windows integration finding and was not used as a substitute route.</w:t>
             </w:r>
           </w:p>
         </w:tc>
@@ -2312,6 +2475,7 @@
               <w:rPr>
                 <w:sz w:val="14"/>
               </w:rPr>
+              <w:t>Passed (source classification)</w:t>
             </w:r>
           </w:p>
         </w:tc>
@@ -2329,6 +2493,7 @@
               <w:rPr>
                 <w:sz w:val="14"/>
               </w:rPr>
+              <w:t>TQ3_0 registered with CPU/CUDA/SYCL quantize/dequantize evidence; 14 bytes/32 values; QJL not implemented; Vulkan TQ3_0 not proven. `experiments/raw-results/animehacker-tq3-0/2026-07-18/acquisition/source-audit.json`</w:t>
             </w:r>
           </w:p>
         </w:tc>
@@ -2607,6 +2772,7 @@
               <w:rPr>
                 <w:sz w:val="14"/>
               </w:rPr>
+              <w:t>Complete - runtime passed; quality 6.23</w:t>
             </w:r>
           </w:p>
         </w:tc>
@@ -2737,6 +2903,7 @@
               <w:rPr>
                 <w:sz w:val="14"/>
               </w:rPr>
+              <w:t>Complete - runtime/activation passed; quality 3.66</w:t>
             </w:r>
           </w:p>
         </w:tc>
@@ -2792,7 +2959,7 @@
               <w:rPr>
                 <w:sz w:val="14"/>
               </w:rPr>
-              <w:t>F16/Q8_0</w:t>
+              <w:t>F16</w:t>
             </w:r>
           </w:p>
         </w:tc>
@@ -2860,6 +3027,7 @@
               <w:rPr>
                 <w:sz w:val="14"/>
               </w:rPr>
+              <w:t>Complete - runtime passed; quality 6.39</w:t>
             </w:r>
           </w:p>
         </w:tc>
@@ -2990,6 +3158,7 @@
               <w:rPr>
                 <w:sz w:val="14"/>
               </w:rPr>
+              <w:t>Complete - runtime passed; quality 6.73</w:t>
             </w:r>
           </w:p>
         </w:tc>
@@ -3113,6 +3282,7 @@
               <w:rPr>
                 <w:sz w:val="14"/>
               </w:rPr>
+              <w:t>Complete - runtime/activation passed; quality 3.28</w:t>
             </w:r>
           </w:p>
         </w:tc>
@@ -3171,7 +3341,7 @@
               <w:rPr>
                 <w:sz w:val="14"/>
               </w:rPr>
-              <w:t>F16/Q8_0</w:t>
+              <w:t>F16</w:t>
             </w:r>
           </w:p>
         </w:tc>
@@ -3243,6 +3413,7 @@
               <w:rPr>
                 <w:sz w:val="14"/>
               </w:rPr>
+              <w:t>Safety-blocked during model load after 3 controlled gates; resolved classification</w:t>
             </w:r>
           </w:p>
         </w:tc>
@@ -3366,6 +3537,7 @@
               <w:rPr>
                 <w:sz w:val="14"/>
               </w:rPr>
+              <w:t>Safety-blocked at final 2 GiB floor; resolved classification</w:t>
             </w:r>
           </w:p>
         </w:tc>
@@ -3442,7 +3614,7 @@
               <w:rPr>
                 <w:sz w:val="14"/>
               </w:rPr>
-              <w:t>GPU partial</w:t>
+              <w:t>SYCL partial</w:t>
             </w:r>
           </w:p>
         </w:tc>
@@ -3478,7 +3650,7 @@
               <w:rPr>
                 <w:sz w:val="14"/>
               </w:rPr>
-              <w:t>GPU baseline if backend exists</w:t>
+              <w:t>Controlled GPU baseline</w:t>
             </w:r>
           </w:p>
         </w:tc>
@@ -3496,6 +3668,7 @@
               <w:rPr>
                 <w:sz w:val="14"/>
               </w:rPr>
+              <w:t>Runtime and quality passed</w:t>
             </w:r>
           </w:p>
         </w:tc>
@@ -3568,7 +3741,7 @@
               <w:rPr>
                 <w:sz w:val="14"/>
               </w:rPr>
-              <w:t>GPU feasible</w:t>
+              <w:t>SYCL partial</w:t>
             </w:r>
           </w:p>
         </w:tc>
@@ -3602,7 +3775,7 @@
               <w:rPr>
                 <w:sz w:val="14"/>
               </w:rPr>
-              <w:t>GPU TQ attempt if supported</w:t>
+              <w:t>GPU TQ attempt</w:t>
             </w:r>
           </w:p>
         </w:tc>
@@ -3619,6 +3792,7 @@
               <w:rPr>
                 <w:sz w:val="14"/>
               </w:rPr>
+              <w:t>Unsupported after controlled runtime proof; resolved</w:t>
             </w:r>
           </w:p>
         </w:tc>
@@ -3677,7 +3851,7 @@
               <w:rPr>
                 <w:sz w:val="14"/>
               </w:rPr>
-              <w:t>Standard/TQ3_0</w:t>
+              <w:t>TQ3_0</w:t>
             </w:r>
           </w:p>
         </w:tc>
@@ -3695,7 +3869,7 @@
               <w:rPr>
                 <w:sz w:val="14"/>
               </w:rPr>
-              <w:t>GPU feasible</w:t>
+              <w:t>SYCL partial</w:t>
             </w:r>
           </w:p>
         </w:tc>
@@ -3713,7 +3887,7 @@
               <w:rPr>
                 <w:sz w:val="14"/>
               </w:rPr>
-              <w:t>4K</w:t>
+              <w:t>2K</w:t>
             </w:r>
           </w:p>
         </w:tc>
@@ -3731,7 +3905,7 @@
               <w:rPr>
                 <w:sz w:val="14"/>
               </w:rPr>
-              <w:t>Optional 8B GPU investigation</w:t>
+              <w:t>Guarded 8B GPU investigation</w:t>
             </w:r>
           </w:p>
         </w:tc>
@@ -3749,6 +3923,7 @@
               <w:rPr>
                 <w:sz w:val="14"/>
               </w:rPr>
+              <w:t>Unsupported by AH-09 kernel proof and 8B memory gate; resolved</w:t>
             </w:r>
           </w:p>
         </w:tc>
@@ -3942,7 +4117,7 @@
               <w:rPr>
                 <w:sz w:val="14"/>
               </w:rPr>
-              <w:t>Frozen GGUF weights</w:t>
+              <w:t>Frozen Q4_K_M GGUF weights</w:t>
             </w:r>
           </w:p>
         </w:tc>
@@ -4010,6 +4185,7 @@
               <w:rPr>
                 <w:sz w:val="14"/>
               </w:rPr>
+              <w:t>Yes</w:t>
             </w:r>
           </w:p>
         </w:tc>
@@ -4026,6 +4202,7 @@
               <w:rPr>
                 <w:sz w:val="14"/>
               </w:rPr>
+              <w:t>Yes - AH-01/AH-03; AH-06 safety-classified</w:t>
             </w:r>
           </w:p>
         </w:tc>
@@ -4066,7 +4243,7 @@
               <w:rPr>
                 <w:sz w:val="14"/>
               </w:rPr>
-              <w:t>Same weights</w:t>
+              <w:t>Same frozen weights</w:t>
             </w:r>
           </w:p>
         </w:tc>
@@ -4138,6 +4315,7 @@
               <w:rPr>
                 <w:sz w:val="14"/>
               </w:rPr>
+              <w:t>Yes</w:t>
             </w:r>
           </w:p>
         </w:tc>
@@ -4155,6 +4333,7 @@
               <w:rPr>
                 <w:sz w:val="14"/>
               </w:rPr>
+              <w:t>Yes - AH-04</w:t>
             </w:r>
           </w:p>
         </w:tc>
@@ -4193,7 +4372,7 @@
               <w:rPr>
                 <w:sz w:val="14"/>
               </w:rPr>
-              <w:t>Same weights</w:t>
+              <w:t>Same frozen weights</w:t>
             </w:r>
           </w:p>
         </w:tc>
@@ -4261,6 +4440,7 @@
               <w:rPr>
                 <w:sz w:val="14"/>
               </w:rPr>
+              <w:t>Yes for 1B/3B</w:t>
             </w:r>
           </w:p>
         </w:tc>
@@ -4277,6 +4457,7 @@
               <w:rPr>
                 <w:sz w:val="14"/>
               </w:rPr>
+              <w:t>Yes - AH-02/AH-05; AH-07 safety-classified</w:t>
             </w:r>
           </w:p>
         </w:tc>
@@ -4335,7 +4516,7 @@
               <w:rPr>
                 <w:sz w:val="14"/>
               </w:rPr>
-              <w:t>Standard</w:t>
+              <w:t>F16</w:t>
             </w:r>
           </w:p>
         </w:tc>
@@ -4353,7 +4534,7 @@
               <w:rPr>
                 <w:sz w:val="14"/>
               </w:rPr>
-              <w:t>Supported GPU backend</w:t>
+              <w:t>SYCL OpenCL partial</w:t>
             </w:r>
           </w:p>
         </w:tc>
@@ -4371,7 +4552,7 @@
               <w:rPr>
                 <w:sz w:val="14"/>
               </w:rPr>
-              <w:t>GPU baseline only if genuine route exists</w:t>
+              <w:t>GPU baseline</w:t>
             </w:r>
           </w:p>
         </w:tc>
@@ -4389,6 +4570,7 @@
               <w:rPr>
                 <w:sz w:val="14"/>
               </w:rPr>
+              <w:t>Yes with CPU fallback</w:t>
             </w:r>
           </w:p>
         </w:tc>
@@ -4406,6 +4588,7 @@
               <w:rPr>
                 <w:sz w:val="14"/>
               </w:rPr>
+              <w:t>Yes - AH-08</w:t>
             </w:r>
           </w:p>
         </w:tc>
@@ -4478,7 +4661,7 @@
               <w:rPr>
                 <w:sz w:val="14"/>
               </w:rPr>
-              <w:t>Supported GPU backend</w:t>
+              <w:t>SYCL OpenCL partial</w:t>
             </w:r>
           </w:p>
         </w:tc>
@@ -4495,7 +4678,7 @@
               <w:rPr>
                 <w:sz w:val="14"/>
               </w:rPr>
-              <w:t>GPU TQ only if implementation supports it</w:t>
+              <w:t>GPU TQ investigation</w:t>
             </w:r>
           </w:p>
         </w:tc>
@@ -4512,6 +4695,7 @@
               <w:rPr>
                 <w:sz w:val="14"/>
               </w:rPr>
+              <w:t>No usable attention runtime on tested device</w:t>
             </w:r>
           </w:p>
         </w:tc>
@@ -4528,6 +4712,7 @@
               <w:rPr>
                 <w:sz w:val="14"/>
               </w:rPr>
+              <w:t>Investigated - AH-09; AH-10 classified from prerequisite proof</w:t>
             </w:r>
           </w:p>
         </w:tc>
@@ -4800,6 +4985,7 @@
               <w:rPr>
                 <w:sz w:val="14"/>
               </w:rPr>
+              <w:t>CPU</w:t>
             </w:r>
           </w:p>
         </w:tc>
@@ -4816,6 +5002,7 @@
               <w:rPr>
                 <w:sz w:val="14"/>
               </w:rPr>
+              <w:t>CPU AVX2</w:t>
             </w:r>
           </w:p>
         </w:tc>
@@ -4832,6 +5019,7 @@
               <w:rPr>
                 <w:sz w:val="14"/>
               </w:rPr>
+              <w:t>0 layers requested for offload (`-ngl 0`)</w:t>
             </w:r>
           </w:p>
         </w:tc>
@@ -4848,6 +5036,7 @@
               <w:rPr>
                 <w:sz w:val="14"/>
               </w:rPr>
+              <w:t>CPU KV</w:t>
             </w:r>
           </w:p>
         </w:tc>
@@ -4864,6 +5053,7 @@
               <w:rPr>
                 <w:sz w:val="14"/>
               </w:rPr>
+              <w:t>No GPU route requested</w:t>
             </w:r>
           </w:p>
         </w:tc>
@@ -4880,6 +5070,7 @@
               <w:rPr>
                 <w:sz w:val="14"/>
               </w:rPr>
+              <w:t>mean 56.90%; median 65.88%; peak 67.00%</w:t>
             </w:r>
           </w:p>
         </w:tc>
@@ -4896,6 +5087,7 @@
               <w:rPr>
                 <w:sz w:val="14"/>
               </w:rPr>
+              <w:t>mean/median/peak 0.00%</w:t>
             </w:r>
           </w:p>
         </w:tc>
@@ -4912,6 +5104,7 @@
               <w:rPr>
                 <w:sz w:val="14"/>
               </w:rPr>
+              <w:t>`experiments/raw-results/animehacker-tq3-0/2026-07-18/runtime/AH-01/summary.json`</w:t>
             </w:r>
           </w:p>
         </w:tc>
@@ -4970,6 +5163,7 @@
               <w:rPr>
                 <w:sz w:val="14"/>
               </w:rPr>
+              <w:t>CPU</w:t>
             </w:r>
           </w:p>
         </w:tc>
@@ -4987,6 +5181,7 @@
               <w:rPr>
                 <w:sz w:val="14"/>
               </w:rPr>
+              <w:t>CPU AVX2</w:t>
             </w:r>
           </w:p>
         </w:tc>
@@ -5004,6 +5199,7 @@
               <w:rPr>
                 <w:sz w:val="14"/>
               </w:rPr>
+              <w:t>0 layers requested for offload (`-ngl 0`)</w:t>
             </w:r>
           </w:p>
         </w:tc>
@@ -5021,6 +5217,7 @@
               <w:rPr>
                 <w:sz w:val="14"/>
               </w:rPr>
+              <w:t>CPU TQ3_0 KV</w:t>
             </w:r>
           </w:p>
         </w:tc>
@@ -5038,6 +5235,7 @@
               <w:rPr>
                 <w:sz w:val="14"/>
               </w:rPr>
+              <w:t>No GPU route requested</w:t>
             </w:r>
           </w:p>
         </w:tc>
@@ -5055,6 +5253,7 @@
               <w:rPr>
                 <w:sz w:val="14"/>
               </w:rPr>
+              <w:t>mean 58.44%; median 65.75%; peak 67.86%</w:t>
             </w:r>
           </w:p>
         </w:tc>
@@ -5072,6 +5271,7 @@
               <w:rPr>
                 <w:sz w:val="14"/>
               </w:rPr>
+              <w:t>mean/median/peak 0.00%</w:t>
             </w:r>
           </w:p>
         </w:tc>
@@ -5089,6 +5289,7 @@
               <w:rPr>
                 <w:sz w:val="14"/>
               </w:rPr>
+              <w:t>`experiments/raw-results/animehacker-tq3-0/2026-07-18/runtime/AH-02/summary.json`</w:t>
             </w:r>
           </w:p>
         </w:tc>
@@ -5144,6 +5345,7 @@
               <w:rPr>
                 <w:sz w:val="14"/>
               </w:rPr>
+              <w:t>CPU</w:t>
             </w:r>
           </w:p>
         </w:tc>
@@ -5160,6 +5362,7 @@
               <w:rPr>
                 <w:sz w:val="14"/>
               </w:rPr>
+              <w:t>CPU AVX2</w:t>
             </w:r>
           </w:p>
         </w:tc>
@@ -5176,6 +5379,7 @@
               <w:rPr>
                 <w:sz w:val="14"/>
               </w:rPr>
+              <w:t>0 layers requested for offload (`-ngl 0`)</w:t>
             </w:r>
           </w:p>
         </w:tc>
@@ -5192,6 +5396,7 @@
               <w:rPr>
                 <w:sz w:val="14"/>
               </w:rPr>
+              <w:t>CPU F16 KV</w:t>
             </w:r>
           </w:p>
         </w:tc>
@@ -5208,6 +5413,7 @@
               <w:rPr>
                 <w:sz w:val="14"/>
               </w:rPr>
+              <w:t>No GPU route requested</w:t>
             </w:r>
           </w:p>
         </w:tc>
@@ -5224,6 +5430,7 @@
               <w:rPr>
                 <w:sz w:val="14"/>
               </w:rPr>
+              <w:t>mean 62.04%; median 65.67%; peak 67.36%</w:t>
             </w:r>
           </w:p>
         </w:tc>
@@ -5240,6 +5447,7 @@
               <w:rPr>
                 <w:sz w:val="14"/>
               </w:rPr>
+              <w:t>mean/median/peak 0.00%</w:t>
             </w:r>
           </w:p>
         </w:tc>
@@ -5256,6 +5464,7 @@
               <w:rPr>
                 <w:sz w:val="14"/>
               </w:rPr>
+              <w:t>`experiments/raw-results/animehacker-tq3-0/2026-07-18/runtime/AH-03/summary.json`</w:t>
             </w:r>
           </w:p>
         </w:tc>
@@ -5314,6 +5523,7 @@
               <w:rPr>
                 <w:sz w:val="14"/>
               </w:rPr>
+              <w:t>CPU</w:t>
             </w:r>
           </w:p>
         </w:tc>
@@ -5331,6 +5541,7 @@
               <w:rPr>
                 <w:sz w:val="14"/>
               </w:rPr>
+              <w:t>CPU AVX2</w:t>
             </w:r>
           </w:p>
         </w:tc>
@@ -5348,6 +5559,7 @@
               <w:rPr>
                 <w:sz w:val="14"/>
               </w:rPr>
+              <w:t>0 layers requested for offload (`-ngl 0`)</w:t>
             </w:r>
           </w:p>
         </w:tc>
@@ -5365,6 +5577,7 @@
               <w:rPr>
                 <w:sz w:val="14"/>
               </w:rPr>
+              <w:t>CPU Q8_0 KV</w:t>
             </w:r>
           </w:p>
         </w:tc>
@@ -5382,6 +5595,7 @@
               <w:rPr>
                 <w:sz w:val="14"/>
               </w:rPr>
+              <w:t>No GPU route requested</w:t>
             </w:r>
           </w:p>
         </w:tc>
@@ -5399,6 +5613,7 @@
               <w:rPr>
                 <w:sz w:val="14"/>
               </w:rPr>
+              <w:t>mean 61.97%; median 65.84%; peak 67.01%</w:t>
             </w:r>
           </w:p>
         </w:tc>
@@ -5416,6 +5631,7 @@
               <w:rPr>
                 <w:sz w:val="14"/>
               </w:rPr>
+              <w:t>mean/median/peak 0.00%</w:t>
             </w:r>
           </w:p>
         </w:tc>
@@ -5433,6 +5649,7 @@
               <w:rPr>
                 <w:sz w:val="14"/>
               </w:rPr>
+              <w:t>`experiments/raw-results/animehacker-tq3-0/2026-07-18/runtime/AH-04/summary.json`</w:t>
             </w:r>
           </w:p>
         </w:tc>
@@ -5488,6 +5705,7 @@
               <w:rPr>
                 <w:sz w:val="14"/>
               </w:rPr>
+              <w:t>CPU</w:t>
             </w:r>
           </w:p>
         </w:tc>
@@ -5504,6 +5722,7 @@
               <w:rPr>
                 <w:sz w:val="14"/>
               </w:rPr>
+              <w:t>CPU AVX2</w:t>
             </w:r>
           </w:p>
         </w:tc>
@@ -5520,6 +5739,7 @@
               <w:rPr>
                 <w:sz w:val="14"/>
               </w:rPr>
+              <w:t>0 layers requested for offload (`-ngl 0`)</w:t>
             </w:r>
           </w:p>
         </w:tc>
@@ -5536,6 +5756,7 @@
               <w:rPr>
                 <w:sz w:val="14"/>
               </w:rPr>
+              <w:t>CPU TQ3_0 KV</w:t>
             </w:r>
           </w:p>
         </w:tc>
@@ -5552,6 +5773,7 @@
               <w:rPr>
                 <w:sz w:val="14"/>
               </w:rPr>
+              <w:t>No GPU route requested</w:t>
             </w:r>
           </w:p>
         </w:tc>
@@ -5568,6 +5790,7 @@
               <w:rPr>
                 <w:sz w:val="14"/>
               </w:rPr>
+              <w:t>mean 62.70%; median 65.62%; peak 67.39%</w:t>
             </w:r>
           </w:p>
         </w:tc>
@@ -5584,6 +5807,7 @@
               <w:rPr>
                 <w:sz w:val="14"/>
               </w:rPr>
+              <w:t>mean/median/peak 0.00%</w:t>
             </w:r>
           </w:p>
         </w:tc>
@@ -5600,6 +5824,7 @@
               <w:rPr>
                 <w:sz w:val="14"/>
               </w:rPr>
+              <w:t>`experiments/raw-results/animehacker-tq3-0/2026-07-18/runtime/AH-05/summary.json`</w:t>
             </w:r>
           </w:p>
         </w:tc>
@@ -5658,6 +5883,7 @@
               <w:rPr>
                 <w:sz w:val="14"/>
               </w:rPr>
+              <w:t>CPU load attempted</w:t>
             </w:r>
           </w:p>
         </w:tc>
@@ -5675,6 +5901,7 @@
               <w:rPr>
                 <w:sz w:val="14"/>
               </w:rPr>
+              <w:t>CPU AVX2</w:t>
             </w:r>
           </w:p>
         </w:tc>
@@ -5692,6 +5919,7 @@
               <w:rPr>
                 <w:sz w:val="14"/>
               </w:rPr>
+              <w:t>0 layers requested (`-ngl 0`)</w:t>
             </w:r>
           </w:p>
         </w:tc>
@@ -5709,6 +5937,7 @@
               <w:rPr>
                 <w:sz w:val="14"/>
               </w:rPr>
+              <w:t>CPU F16 KV allocation reached 320.00 MiB</w:t>
             </w:r>
           </w:p>
         </w:tc>
@@ -5726,6 +5955,7 @@
               <w:rPr>
                 <w:sz w:val="14"/>
               </w:rPr>
+              <w:t>No GPU route requested</w:t>
             </w:r>
           </w:p>
         </w:tc>
@@ -5743,6 +5973,7 @@
               <w:rPr>
                 <w:sz w:val="14"/>
               </w:rPr>
+              <w:t>Not measured: emergency stop occurred before request</w:t>
             </w:r>
           </w:p>
         </w:tc>
@@ -5760,6 +5991,7 @@
               <w:rPr>
                 <w:sz w:val="14"/>
               </w:rPr>
+              <w:t>Measured 0% before request; no request-window result</w:t>
             </w:r>
           </w:p>
         </w:tc>
@@ -5777,6 +6009,7 @@
               <w:rPr>
                 <w:sz w:val="14"/>
               </w:rPr>
+              <w:t>`experiments/raw-results/animehacker-tq3-0/2026-07-18/runtime/AH-06/pilot-emergency-stop-3072/`; `pilot-emergency-stop-2560/`; `pilot-emergency-stop-2048/`</w:t>
             </w:r>
           </w:p>
         </w:tc>
@@ -5832,6 +6065,7 @@
               <w:rPr>
                 <w:sz w:val="14"/>
               </w:rPr>
+              <w:t>CPU load attempted</w:t>
             </w:r>
           </w:p>
         </w:tc>
@@ -5848,6 +6082,7 @@
               <w:rPr>
                 <w:sz w:val="14"/>
               </w:rPr>
+              <w:t>CPU AVX2</w:t>
             </w:r>
           </w:p>
         </w:tc>
@@ -5864,6 +6099,7 @@
               <w:rPr>
                 <w:sz w:val="14"/>
               </w:rPr>
+              <w:t>0 layers requested (`-ngl 0`)</w:t>
             </w:r>
           </w:p>
         </w:tc>
@@ -5880,6 +6116,7 @@
               <w:rPr>
                 <w:sz w:val="14"/>
               </w:rPr>
+              <w:t>CPU TQ3_0 KV allocation reached 140.00 MiB</w:t>
             </w:r>
           </w:p>
         </w:tc>
@@ -5896,6 +6133,7 @@
               <w:rPr>
                 <w:sz w:val="14"/>
               </w:rPr>
+              <w:t>No GPU route requested</w:t>
             </w:r>
           </w:p>
         </w:tc>
@@ -5912,6 +6150,7 @@
               <w:rPr>
                 <w:sz w:val="14"/>
               </w:rPr>
+              <w:t>Not measured: emergency stop occurred before request</w:t>
             </w:r>
           </w:p>
         </w:tc>
@@ -5928,6 +6167,7 @@
               <w:rPr>
                 <w:sz w:val="14"/>
               </w:rPr>
+              <w:t>Measured 0% before request; no request-window result</w:t>
             </w:r>
           </w:p>
         </w:tc>
@@ -5944,6 +6184,7 @@
               <w:rPr>
                 <w:sz w:val="14"/>
               </w:rPr>
+              <w:t>`experiments/raw-results/animehacker-tq3-0/2026-07-18/runtime/AH-07/pilot/`</w:t>
             </w:r>
           </w:p>
         </w:tc>
@@ -6002,6 +6243,7 @@
               <w:rPr>
                 <w:sz w:val="14"/>
               </w:rPr>
+              <w:t>Intel UHD Graphics</w:t>
             </w:r>
           </w:p>
         </w:tc>
@@ -6019,6 +6261,7 @@
               <w:rPr>
                 <w:sz w:val="14"/>
               </w:rPr>
+              <w:t>SYCL OpenCL</w:t>
             </w:r>
           </w:p>
         </w:tc>
@@ -6036,6 +6279,7 @@
               <w:rPr>
                 <w:sz w:val="14"/>
               </w:rPr>
+              <w:t>1/41 layers</w:t>
             </w:r>
           </w:p>
         </w:tc>
@@ -6053,6 +6297,7 @@
               <w:rPr>
                 <w:sz w:val="14"/>
               </w:rPr>
+              <w:t>CPU F16 KV</w:t>
             </w:r>
           </w:p>
         </w:tc>
@@ -6070,6 +6315,7 @@
               <w:rPr>
                 <w:sz w:val="14"/>
               </w:rPr>
+              <w:t>Yes, remaining 40 layers and KV on CPU</w:t>
             </w:r>
           </w:p>
         </w:tc>
@@ -6087,6 +6333,7 @@
               <w:rPr>
                 <w:sz w:val="14"/>
               </w:rPr>
+              <w:t>mean 62.03%; median 66.11%; peak 67.60%</w:t>
             </w:r>
           </w:p>
         </w:tc>
@@ -6104,6 +6351,7 @@
               <w:rPr>
                 <w:sz w:val="14"/>
               </w:rPr>
+              <w:t>mean 16.31%; median 16.00%; peak 20.00%; 407.98 MiB peak process GPU memory</w:t>
             </w:r>
           </w:p>
         </w:tc>
@@ -6121,6 +6369,7 @@
               <w:rPr>
                 <w:sz w:val="14"/>
               </w:rPr>
+              <w:t>`experiments/raw-results/animehacker-tq3-0/2026-07-18/runtime/AH-08/summary.json`</w:t>
             </w:r>
           </w:p>
         </w:tc>
@@ -6176,6 +6425,7 @@
               <w:rPr>
                 <w:sz w:val="14"/>
               </w:rPr>
+              <w:t>Intel UHD Graphics</w:t>
             </w:r>
           </w:p>
         </w:tc>
@@ -6192,6 +6442,7 @@
               <w:rPr>
                 <w:sz w:val="14"/>
               </w:rPr>
+              <w:t>SYCL OpenCL</w:t>
             </w:r>
           </w:p>
         </w:tc>
@@ -6208,6 +6459,7 @@
               <w:rPr>
                 <w:sz w:val="14"/>
               </w:rPr>
+              <w:t>Unsupported: TQ3 attention offload aborts in `mmvq.cpp:1149`; flash path emits one-token invalid output</w:t>
             </w:r>
           </w:p>
         </w:tc>
@@ -6224,6 +6476,7 @@
               <w:rPr>
                 <w:sz w:val="14"/>
               </w:rPr>
+              <w:t>CPU TQ3_0 KV allocation proven before abort</w:t>
             </w:r>
           </w:p>
         </w:tc>
@@ -6240,6 +6493,7 @@
               <w:rPr>
                 <w:sz w:val="14"/>
               </w:rPr>
+              <w:t>Yes; CPU-only AH-05 is the valid TQ3 route</w:t>
             </w:r>
           </w:p>
         </w:tc>
@@ -6256,6 +6510,7 @@
               <w:rPr>
                 <w:sz w:val="14"/>
               </w:rPr>
+              <w:t>Rejected attempts measured only; not reported as performance</w:t>
             </w:r>
           </w:p>
         </w:tc>
@@ -6272,6 +6527,7 @@
               <w:rPr>
                 <w:sz w:val="14"/>
               </w:rPr>
+              <w:t>Rejected attempts measured 4% before abort/invalid response</w:t>
             </w:r>
           </w:p>
         </w:tc>
@@ -6288,6 +6544,7 @@
               <w:rPr>
                 <w:sz w:val="14"/>
               </w:rPr>
+              <w:t>`experiments/raw-results/animehacker-tq3-0/2026-07-18/runtime/AH-09-rejected-flash-env-only/`; `AH-09-rejected-explicit-flash-off-layer/`</w:t>
             </w:r>
           </w:p>
         </w:tc>
@@ -6346,6 +6603,7 @@
               <w:rPr>
                 <w:sz w:val="14"/>
               </w:rPr>
+              <w:t>Intel UHD Graphics</w:t>
             </w:r>
           </w:p>
         </w:tc>
@@ -6363,6 +6621,7 @@
               <w:rPr>
                 <w:sz w:val="14"/>
               </w:rPr>
+              <w:t>SYCL OpenCL</w:t>
             </w:r>
           </w:p>
         </w:tc>
@@ -6380,6 +6639,7 @@
               <w:rPr>
                 <w:sz w:val="14"/>
               </w:rPr>
+              <w:t>Not launched: same TQ3 SYCL kernel is unsupported and 8B standard load crossed the memory gate</w:t>
             </w:r>
           </w:p>
         </w:tc>
@@ -6397,6 +6657,7 @@
               <w:rPr>
                 <w:sz w:val="14"/>
               </w:rPr>
+              <w:t>Not allocated because prerequisite capability failed</w:t>
             </w:r>
           </w:p>
         </w:tc>
@@ -6414,6 +6675,7 @@
               <w:rPr>
                 <w:sz w:val="14"/>
               </w:rPr>
+              <w:t>CPU AH-07 remains the only potentially valid TQ3 route</w:t>
             </w:r>
           </w:p>
         </w:tc>
@@ -6431,6 +6693,7 @@
               <w:rPr>
                 <w:sz w:val="14"/>
               </w:rPr>
+              <w:t>Not measured because launch was prohibited by proven prerequisite</w:t>
             </w:r>
           </w:p>
         </w:tc>
@@ -6448,6 +6711,7 @@
               <w:rPr>
                 <w:sz w:val="14"/>
               </w:rPr>
+              <w:t>Not measured because launch was prohibited by proven prerequisite</w:t>
             </w:r>
           </w:p>
         </w:tc>
@@ -6465,6 +6729,7 @@
               <w:rPr>
                 <w:sz w:val="14"/>
               </w:rPr>
+              <w:t>AH-09 failure evidence plus `experiments/raw-results/animehacker-tq3-0/2026-07-18/runtime/AH-06/pilot-emergency-stop-2048/`</w:t>
             </w:r>
           </w:p>
         </w:tc>
@@ -6868,6 +7133,7 @@
               <w:rPr>
                 <w:sz w:val="14"/>
               </w:rPr>
+              <w:t>929.48 peak WS; 730.87 peak private</w:t>
             </w:r>
           </w:p>
         </w:tc>
@@ -6884,6 +7150,7 @@
               <w:rPr>
                 <w:sz w:val="14"/>
               </w:rPr>
+              <w:t>26.00</w:t>
             </w:r>
           </w:p>
         </w:tc>
@@ -6900,6 +7167,7 @@
               <w:rPr>
                 <w:sz w:val="14"/>
               </w:rPr>
+              <w:t>140.39 median</w:t>
             </w:r>
           </w:p>
         </w:tc>
@@ -6916,6 +7184,7 @@
               <w:rPr>
                 <w:sz w:val="14"/>
               </w:rPr>
+              <w:t>46.32 decode; 95.31 prompt</w:t>
             </w:r>
           </w:p>
         </w:tc>
@@ -6932,6 +7201,7 @@
               <w:rPr>
                 <w:sz w:val="14"/>
               </w:rPr>
+              <w:t>6.23</w:t>
             </w:r>
           </w:p>
         </w:tc>
@@ -6948,6 +7218,7 @@
               <w:rPr>
                 <w:sz w:val="14"/>
               </w:rPr>
+              <w:t>Runtime and quality passed</w:t>
             </w:r>
           </w:p>
         </w:tc>
@@ -7096,6 +7367,7 @@
               <w:rPr>
                 <w:sz w:val="14"/>
               </w:rPr>
+              <w:t>911.05 peak WS; 712.91 peak private</w:t>
             </w:r>
           </w:p>
         </w:tc>
@@ -7113,6 +7385,7 @@
               <w:rPr>
                 <w:sz w:val="14"/>
               </w:rPr>
+              <w:t>5.69</w:t>
             </w:r>
           </w:p>
         </w:tc>
@@ -7130,6 +7403,7 @@
               <w:rPr>
                 <w:sz w:val="14"/>
               </w:rPr>
+              <w:t>137.75 median</w:t>
             </w:r>
           </w:p>
         </w:tc>
@@ -7147,6 +7421,7 @@
               <w:rPr>
                 <w:sz w:val="14"/>
               </w:rPr>
+              <w:t>37.75 decode; 81.51 prompt</w:t>
             </w:r>
           </w:p>
         </w:tc>
@@ -7164,6 +7439,7 @@
               <w:rPr>
                 <w:sz w:val="14"/>
               </w:rPr>
+              <w:t>3.66</w:t>
             </w:r>
           </w:p>
         </w:tc>
@@ -7181,6 +7457,7 @@
               <w:rPr>
                 <w:sz w:val="14"/>
               </w:rPr>
+              <w:t>Runtime passed; harsh quality regression recorded</w:t>
             </w:r>
           </w:p>
         </w:tc>
@@ -7236,7 +7513,7 @@
               <w:rPr>
                 <w:sz w:val="14"/>
               </w:rPr>
-              <w:t>BF16 GGUF</w:t>
+              <w:t>Q4_K_M GGUF</w:t>
             </w:r>
           </w:p>
         </w:tc>
@@ -7321,6 +7598,7 @@
               <w:rPr>
                 <w:sz w:val="14"/>
               </w:rPr>
+              <w:t>3662.86 peak WS; 1944.03 peak private</w:t>
             </w:r>
           </w:p>
         </w:tc>
@@ -7337,6 +7615,7 @@
               <w:rPr>
                 <w:sz w:val="14"/>
               </w:rPr>
+              <w:t>160.00</w:t>
             </w:r>
           </w:p>
         </w:tc>
@@ -7353,6 +7632,7 @@
               <w:rPr>
                 <w:sz w:val="14"/>
               </w:rPr>
+              <w:t>274.92 median</w:t>
             </w:r>
           </w:p>
         </w:tc>
@@ -7369,6 +7649,7 @@
               <w:rPr>
                 <w:sz w:val="14"/>
               </w:rPr>
+              <w:t>15.87 decode; 45.69 prompt</w:t>
             </w:r>
           </w:p>
         </w:tc>
@@ -7385,6 +7666,7 @@
               <w:rPr>
                 <w:sz w:val="14"/>
               </w:rPr>
+              <w:t>6.39</w:t>
             </w:r>
           </w:p>
         </w:tc>
@@ -7401,6 +7683,7 @@
               <w:rPr>
                 <w:sz w:val="14"/>
               </w:rPr>
+              <w:t>Runtime and quality passed</w:t>
             </w:r>
           </w:p>
         </w:tc>
@@ -7459,7 +7742,7 @@
               <w:rPr>
                 <w:sz w:val="14"/>
               </w:rPr>
-              <w:t>BF16 GGUF</w:t>
+              <w:t>Q4_K_M GGUF</w:t>
             </w:r>
           </w:p>
         </w:tc>
@@ -7549,6 +7832,7 @@
               <w:rPr>
                 <w:sz w:val="14"/>
               </w:rPr>
+              <w:t>3671.96 peak WS; 1933.01 peak private</w:t>
             </w:r>
           </w:p>
         </w:tc>
@@ -7566,6 +7850,7 @@
               <w:rPr>
                 <w:sz w:val="14"/>
               </w:rPr>
+              <w:t>170.00</w:t>
             </w:r>
           </w:p>
         </w:tc>
@@ -7583,6 +7868,7 @@
               <w:rPr>
                 <w:sz w:val="14"/>
               </w:rPr>
+              <w:t>243.23 median</w:t>
             </w:r>
           </w:p>
         </w:tc>
@@ -7600,6 +7886,7 @@
               <w:rPr>
                 <w:sz w:val="14"/>
               </w:rPr>
+              <w:t>15.82 decode; 52.03 prompt</w:t>
             </w:r>
           </w:p>
         </w:tc>
@@ -7617,6 +7904,7 @@
               <w:rPr>
                 <w:sz w:val="14"/>
               </w:rPr>
+              <w:t>6.73</w:t>
             </w:r>
           </w:p>
         </w:tc>
@@ -7634,6 +7922,7 @@
               <w:rPr>
                 <w:sz w:val="14"/>
               </w:rPr>
+              <w:t>Runtime and quality passed after bounded P5 retry</w:t>
             </w:r>
           </w:p>
         </w:tc>
@@ -7689,7 +7978,7 @@
               <w:rPr>
                 <w:sz w:val="14"/>
               </w:rPr>
-              <w:t>BF16 GGUF</w:t>
+              <w:t>Q4_K_M GGUF</w:t>
             </w:r>
           </w:p>
         </w:tc>
@@ -7774,6 +8063,7 @@
               <w:rPr>
                 <w:sz w:val="14"/>
               </w:rPr>
+              <w:t>3574.63 peak WS; 1837.87 peak private</w:t>
             </w:r>
           </w:p>
         </w:tc>
@@ -7790,6 +8080,7 @@
               <w:rPr>
                 <w:sz w:val="14"/>
               </w:rPr>
+              <w:t>70.00</w:t>
             </w:r>
           </w:p>
         </w:tc>
@@ -7806,6 +8097,7 @@
               <w:rPr>
                 <w:sz w:val="14"/>
               </w:rPr>
+              <w:t>252.57 median</w:t>
             </w:r>
           </w:p>
         </w:tc>
@@ -7822,6 +8114,7 @@
               <w:rPr>
                 <w:sz w:val="14"/>
               </w:rPr>
+              <w:t>11.54 decode; 50.69 prompt</w:t>
             </w:r>
           </w:p>
         </w:tc>
@@ -7838,6 +8131,7 @@
               <w:rPr>
                 <w:sz w:val="14"/>
               </w:rPr>
+              <w:t>3.28</w:t>
             </w:r>
           </w:p>
         </w:tc>
@@ -7854,6 +8148,7 @@
               <w:rPr>
                 <w:sz w:val="14"/>
               </w:rPr>
+              <w:t>Runtime passed; harsh quality regression recorded</w:t>
             </w:r>
           </w:p>
         </w:tc>
@@ -7912,7 +8207,7 @@
               <w:rPr>
                 <w:sz w:val="14"/>
               </w:rPr>
-              <w:t>Q8_0 GGUF</w:t>
+              <w:t>Q4_K_M GGUF</w:t>
             </w:r>
           </w:p>
         </w:tc>
@@ -8002,6 +8297,7 @@
               <w:rPr>
                 <w:sz w:val="14"/>
               </w:rPr>
+              <w:t>8913.65 peak WS before final gate; 4317.87 peak private</w:t>
             </w:r>
           </w:p>
         </w:tc>
@@ -8019,6 +8315,7 @@
               <w:rPr>
                 <w:sz w:val="14"/>
               </w:rPr>
+              <w:t>320.00 allocation before stop</w:t>
             </w:r>
           </w:p>
         </w:tc>
@@ -8036,6 +8333,7 @@
               <w:rPr>
                 <w:sz w:val="14"/>
               </w:rPr>
+              <w:t>Not measured: stopped before request</w:t>
             </w:r>
           </w:p>
         </w:tc>
@@ -8053,6 +8351,7 @@
               <w:rPr>
                 <w:sz w:val="14"/>
               </w:rPr>
+              <w:t>Not measured: stopped before request</w:t>
             </w:r>
           </w:p>
         </w:tc>
@@ -8070,6 +8369,7 @@
               <w:rPr>
                 <w:sz w:val="14"/>
               </w:rPr>
+              <w:t>Not scored: safety prerequisite blocked</w:t>
             </w:r>
           </w:p>
         </w:tc>
@@ -8087,6 +8387,7 @@
               <w:rPr>
                 <w:sz w:val="14"/>
               </w:rPr>
+              <w:t>Safety-classified; no unresolved failed inference</w:t>
             </w:r>
           </w:p>
         </w:tc>
@@ -8142,7 +8443,7 @@
               <w:rPr>
                 <w:sz w:val="14"/>
               </w:rPr>
-              <w:t>Q8_0 GGUF</w:t>
+              <w:t>Q4_K_M GGUF</w:t>
             </w:r>
           </w:p>
         </w:tc>
@@ -8227,6 +8528,7 @@
               <w:rPr>
                 <w:sz w:val="14"/>
               </w:rPr>
+              <w:t>8737.70 peak WS before gate; 4137.68 peak private</w:t>
             </w:r>
           </w:p>
         </w:tc>
@@ -8243,6 +8545,7 @@
               <w:rPr>
                 <w:sz w:val="14"/>
               </w:rPr>
+              <w:t>140.00 allocation before stop</w:t>
             </w:r>
           </w:p>
         </w:tc>
@@ -8259,6 +8562,7 @@
               <w:rPr>
                 <w:sz w:val="14"/>
               </w:rPr>
+              <w:t>Not measured: stopped before request</w:t>
             </w:r>
           </w:p>
         </w:tc>
@@ -8275,6 +8579,7 @@
               <w:rPr>
                 <w:sz w:val="14"/>
               </w:rPr>
+              <w:t>Not measured: stopped before request</w:t>
             </w:r>
           </w:p>
         </w:tc>
@@ -8291,6 +8596,7 @@
               <w:rPr>
                 <w:sz w:val="14"/>
               </w:rPr>
+              <w:t>Not scored: safety prerequisite blocked</w:t>
             </w:r>
           </w:p>
         </w:tc>
@@ -8307,6 +8613,7 @@
               <w:rPr>
                 <w:sz w:val="14"/>
               </w:rPr>
+              <w:t>Safety-classified; no unresolved failed inference</w:t>
             </w:r>
           </w:p>
         </w:tc>
@@ -8365,7 +8672,7 @@
               <w:rPr>
                 <w:sz w:val="14"/>
               </w:rPr>
-              <w:t>BF16 GGUF</w:t>
+              <w:t>Q4_K_M GGUF</w:t>
             </w:r>
           </w:p>
         </w:tc>
@@ -8455,6 +8762,7 @@
               <w:rPr>
                 <w:sz w:val="14"/>
               </w:rPr>
+              <w:t>3130.27 peak WS; 1289.04 peak private</w:t>
             </w:r>
           </w:p>
         </w:tc>
@@ -8472,6 +8780,7 @@
               <w:rPr>
                 <w:sz w:val="14"/>
               </w:rPr>
+              <w:t>320.00</w:t>
             </w:r>
           </w:p>
         </w:tc>
@@ -8489,6 +8798,7 @@
               <w:rPr>
                 <w:sz w:val="14"/>
               </w:rPr>
+              <w:t>309.95 median</w:t>
             </w:r>
           </w:p>
         </w:tc>
@@ -8506,6 +8816,7 @@
               <w:rPr>
                 <w:sz w:val="14"/>
               </w:rPr>
+              <w:t>15.18 decode; 40.93 prompt</w:t>
             </w:r>
           </w:p>
         </w:tc>
@@ -8523,6 +8834,7 @@
               <w:rPr>
                 <w:sz w:val="14"/>
               </w:rPr>
+              <w:t>6.27</w:t>
             </w:r>
           </w:p>
         </w:tc>
@@ -8540,6 +8852,7 @@
               <w:rPr>
                 <w:sz w:val="14"/>
               </w:rPr>
+              <w:t>Runtime and quality passed; 1/41 layers on SYCL</w:t>
             </w:r>
           </w:p>
         </w:tc>
@@ -8595,7 +8908,7 @@
               <w:rPr>
                 <w:sz w:val="14"/>
               </w:rPr>
-              <w:t>BF16 GGUF</w:t>
+              <w:t>Q4_K_M GGUF</w:t>
             </w:r>
           </w:p>
         </w:tc>
@@ -8646,7 +8959,7 @@
               <w:rPr>
                 <w:sz w:val="14"/>
               </w:rPr>
-              <w:t>SYCL partial (-ngl 1)</w:t>
+              <w:t>SYCL partial</w:t>
             </w:r>
           </w:p>
         </w:tc>
@@ -8680,6 +8993,7 @@
               <w:rPr>
                 <w:sz w:val="14"/>
               </w:rPr>
+              <w:t>Rejected attempt: 2880.77 peak WS</w:t>
             </w:r>
           </w:p>
         </w:tc>
@@ -8696,6 +9010,7 @@
               <w:rPr>
                 <w:sz w:val="14"/>
               </w:rPr>
+              <w:t>70.00 allocation proven</w:t>
             </w:r>
           </w:p>
         </w:tc>
@@ -8712,6 +9027,7 @@
               <w:rPr>
                 <w:sz w:val="14"/>
               </w:rPr>
+              <w:t>Rejected one-token response; not a valid TTFT result</w:t>
             </w:r>
           </w:p>
         </w:tc>
@@ -8728,6 +9044,7 @@
               <w:rPr>
                 <w:sz w:val="14"/>
               </w:rPr>
+              <w:t>Rejected 1-token sentinel; no valid throughput</w:t>
             </w:r>
           </w:p>
         </w:tc>
@@ -8744,6 +9061,7 @@
               <w:rPr>
                 <w:sz w:val="14"/>
               </w:rPr>
+              <w:t>Not scored: runnable prerequisite disproven</w:t>
             </w:r>
           </w:p>
         </w:tc>
@@ -8760,6 +9078,7 @@
               <w:rPr>
                 <w:sz w:val="14"/>
               </w:rPr>
+              <w:t>Unsupported after controlled proof; no unresolved failure</w:t>
             </w:r>
           </w:p>
         </w:tc>
@@ -8818,7 +9137,7 @@
               <w:rPr>
                 <w:sz w:val="14"/>
               </w:rPr>
-              <w:t>Q8_0 GGUF</w:t>
+              <w:t>Q4_K_M GGUF</w:t>
             </w:r>
           </w:p>
         </w:tc>
@@ -8890,7 +9209,7 @@
               <w:rPr>
                 <w:sz w:val="14"/>
               </w:rPr>
-              <w:t>2K planned</w:t>
+              <w:t>2K</w:t>
             </w:r>
           </w:p>
         </w:tc>
@@ -8908,6 +9227,7 @@
               <w:rPr>
                 <w:sz w:val="14"/>
               </w:rPr>
+              <w:t>Not measured: launch prohibited by AH-09 kernel proof and 8B gate</w:t>
             </w:r>
           </w:p>
         </w:tc>
@@ -8925,6 +9245,7 @@
               <w:rPr>
                 <w:sz w:val="14"/>
               </w:rPr>
+              <w:t>Predicted allocation not reported as measurement</w:t>
             </w:r>
           </w:p>
         </w:tc>
@@ -8942,6 +9263,7 @@
               <w:rPr>
                 <w:sz w:val="14"/>
               </w:rPr>
+              <w:t>Not measured: prerequisite unsupported</w:t>
             </w:r>
           </w:p>
         </w:tc>
@@ -8959,6 +9281,7 @@
               <w:rPr>
                 <w:sz w:val="14"/>
               </w:rPr>
+              <w:t>Not measured: prerequisite unsupported</w:t>
             </w:r>
           </w:p>
         </w:tc>
@@ -8976,6 +9299,7 @@
               <w:rPr>
                 <w:sz w:val="14"/>
               </w:rPr>
+              <w:t>Not scored: prerequisite unsupported</w:t>
             </w:r>
           </w:p>
         </w:tc>
@@ -8993,6 +9317,7 @@
               <w:rPr>
                 <w:sz w:val="14"/>
               </w:rPr>
+              <w:t>Unsupported before launch; no unresolved failure</w:t>
             </w:r>
           </w:p>
         </w:tc>
@@ -9229,6 +9554,7 @@
               <w:rPr>
                 <w:sz w:val="14"/>
               </w:rPr>
+              <w:t>4.00</w:t>
             </w:r>
           </w:p>
         </w:tc>
@@ -9245,6 +9571,7 @@
               <w:rPr>
                 <w:sz w:val="14"/>
               </w:rPr>
+              <w:t>4.00</w:t>
             </w:r>
           </w:p>
         </w:tc>
@@ -9261,6 +9588,7 @@
               <w:rPr>
                 <w:sz w:val="14"/>
               </w:rPr>
+              <w:t>Baseline Yes; TQ3 No</w:t>
             </w:r>
           </w:p>
         </w:tc>
@@ -9277,6 +9605,7 @@
               <w:rPr>
                 <w:sz w:val="14"/>
               </w:rPr>
+              <w:t>Baseline No; TQ3 No</w:t>
             </w:r>
           </w:p>
         </w:tc>
@@ -9293,6 +9622,7 @@
               <w:rPr>
                 <w:sz w:val="14"/>
               </w:rPr>
+              <w:t>No</w:t>
             </w:r>
           </w:p>
         </w:tc>
@@ -9309,6 +9639,7 @@
               <w:rPr>
                 <w:sz w:val="14"/>
               </w:rPr>
+              <w:t>TQ3 returned 3 bullets and omitted required semantic slots</w:t>
             </w:r>
           </w:p>
         </w:tc>
@@ -9367,6 +9698,7 @@
               <w:rPr>
                 <w:sz w:val="14"/>
               </w:rPr>
+              <w:t>8.35</w:t>
             </w:r>
           </w:p>
         </w:tc>
@@ -9384,6 +9716,7 @@
               <w:rPr>
                 <w:sz w:val="14"/>
               </w:rPr>
+              <w:t>8.35</w:t>
             </w:r>
           </w:p>
         </w:tc>
@@ -9401,6 +9734,7 @@
               <w:rPr>
                 <w:sz w:val="14"/>
               </w:rPr>
+              <w:t>Yes / Yes</w:t>
             </w:r>
           </w:p>
         </w:tc>
@@ -9418,6 +9752,7 @@
               <w:rPr>
                 <w:sz w:val="14"/>
               </w:rPr>
+              <w:t>Yes / Yes</w:t>
             </w:r>
           </w:p>
         </w:tc>
@@ -9435,6 +9770,7 @@
               <w:rPr>
                 <w:sz w:val="14"/>
               </w:rPr>
+              <w:t>No</w:t>
             </w:r>
           </w:p>
         </w:tc>
@@ -9452,6 +9788,7 @@
               <w:rPr>
                 <w:sz w:val="14"/>
               </w:rPr>
+              <w:t>Both passed the exact three-line structure</w:t>
             </w:r>
           </w:p>
         </w:tc>
@@ -9507,6 +9844,7 @@
               <w:rPr>
                 <w:sz w:val="14"/>
               </w:rPr>
+              <w:t>4.00</w:t>
             </w:r>
           </w:p>
         </w:tc>
@@ -9523,6 +9861,7 @@
               <w:rPr>
                 <w:sz w:val="14"/>
               </w:rPr>
+              <w:t>2.00</w:t>
             </w:r>
           </w:p>
         </w:tc>
@@ -9539,6 +9878,7 @@
               <w:rPr>
                 <w:sz w:val="14"/>
               </w:rPr>
+              <w:t>Baseline Yes; TQ3 No</w:t>
             </w:r>
           </w:p>
         </w:tc>
@@ -9555,6 +9895,7 @@
               <w:rPr>
                 <w:sz w:val="14"/>
               </w:rPr>
+              <w:t>No / No</w:t>
             </w:r>
           </w:p>
         </w:tc>
@@ -9571,6 +9912,7 @@
               <w:rPr>
                 <w:sz w:val="14"/>
               </w:rPr>
+              <w:t>No</w:t>
             </w:r>
           </w:p>
         </w:tc>
@@ -9587,6 +9929,7 @@
               <w:rPr>
                 <w:sz w:val="14"/>
               </w:rPr>
+              <w:t>TQ3 emitted invalid schema/JSON and received the structural cap</w:t>
             </w:r>
           </w:p>
         </w:tc>
@@ -9645,6 +9988,7 @@
               <w:rPr>
                 <w:sz w:val="14"/>
               </w:rPr>
+              <w:t>10.00</w:t>
             </w:r>
           </w:p>
         </w:tc>
@@ -9662,6 +10006,7 @@
               <w:rPr>
                 <w:sz w:val="14"/>
               </w:rPr>
+              <w:t>4.00</w:t>
             </w:r>
           </w:p>
         </w:tc>
@@ -9679,6 +10024,7 @@
               <w:rPr>
                 <w:sz w:val="14"/>
               </w:rPr>
+              <w:t>Baseline Yes; TQ3 No</w:t>
             </w:r>
           </w:p>
         </w:tc>
@@ -9696,6 +10042,7 @@
               <w:rPr>
                 <w:sz w:val="14"/>
               </w:rPr>
+              <w:t>Baseline Yes; TQ3 No</w:t>
             </w:r>
           </w:p>
         </w:tc>
@@ -9713,6 +10060,7 @@
               <w:rPr>
                 <w:sz w:val="14"/>
               </w:rPr>
+              <w:t>No</w:t>
             </w:r>
           </w:p>
         </w:tc>
@@ -9730,6 +10078,7 @@
               <w:rPr>
                 <w:sz w:val="14"/>
               </w:rPr>
+              <w:t>TQ3 used one sentence and omitted the runtime fact</w:t>
             </w:r>
           </w:p>
         </w:tc>
@@ -9785,6 +10134,7 @@
               <w:rPr>
                 <w:sz w:val="14"/>
               </w:rPr>
+              <w:t>10.00</w:t>
             </w:r>
           </w:p>
         </w:tc>
@@ -9801,6 +10151,7 @@
               <w:rPr>
                 <w:sz w:val="14"/>
               </w:rPr>
+              <w:t>1.30</w:t>
             </w:r>
           </w:p>
         </w:tc>
@@ -9817,6 +10168,7 @@
               <w:rPr>
                 <w:sz w:val="14"/>
               </w:rPr>
+              <w:t>Baseline Yes; TQ3 No</w:t>
             </w:r>
           </w:p>
         </w:tc>
@@ -9833,6 +10185,7 @@
               <w:rPr>
                 <w:sz w:val="14"/>
               </w:rPr>
+              <w:t>Baseline Yes; TQ3 No</w:t>
             </w:r>
           </w:p>
         </w:tc>
@@ -9849,6 +10202,7 @@
               <w:rPr>
                 <w:sz w:val="14"/>
               </w:rPr>
+              <w:t>No</w:t>
             </w:r>
           </w:p>
         </w:tc>
@@ -9865,6 +10219,7 @@
               <w:rPr>
                 <w:sz w:val="14"/>
               </w:rPr>
+              <w:t>TQ3 returned the wrong marker; raw response retained</w:t>
             </w:r>
           </w:p>
         </w:tc>
@@ -9923,6 +10278,7 @@
               <w:rPr>
                 <w:sz w:val="14"/>
               </w:rPr>
+              <w:t>2.00</w:t>
             </w:r>
           </w:p>
         </w:tc>
@@ -9940,6 +10296,7 @@
               <w:rPr>
                 <w:sz w:val="14"/>
               </w:rPr>
+              <w:t>0.00</w:t>
             </w:r>
           </w:p>
         </w:tc>
@@ -9957,6 +10314,7 @@
               <w:rPr>
                 <w:sz w:val="14"/>
               </w:rPr>
+              <w:t>No / No</w:t>
             </w:r>
           </w:p>
         </w:tc>
@@ -9974,6 +10332,7 @@
               <w:rPr>
                 <w:sz w:val="14"/>
               </w:rPr>
+              <w:t>No / No</w:t>
             </w:r>
           </w:p>
         </w:tc>
@@ -9991,6 +10350,7 @@
               <w:rPr>
                 <w:sz w:val="14"/>
               </w:rPr>
+              <w:t>Yes / Yes</w:t>
             </w:r>
           </w:p>
         </w:tc>
@@ -10008,6 +10368,7 @@
               <w:rPr>
                 <w:sz w:val="14"/>
               </w:rPr>
+              <w:t>Baseline omitted the amber prefix; TQ3 response was unusable</w:t>
             </w:r>
           </w:p>
         </w:tc>
@@ -10063,6 +10424,7 @@
               <w:rPr>
                 <w:sz w:val="14"/>
               </w:rPr>
+              <w:t>6.39</w:t>
             </w:r>
           </w:p>
         </w:tc>
@@ -10079,6 +10441,7 @@
               <w:rPr>
                 <w:sz w:val="14"/>
               </w:rPr>
+              <w:t>3.28</w:t>
             </w:r>
           </w:p>
         </w:tc>
@@ -10095,6 +10458,7 @@
               <w:rPr>
                 <w:sz w:val="14"/>
               </w:rPr>
+              <w:t>Mixed; deterministic gates applied</w:t>
             </w:r>
           </w:p>
         </w:tc>
@@ -10111,6 +10475,7 @@
               <w:rPr>
                 <w:sz w:val="14"/>
               </w:rPr>
+              <w:t>TQ3 retained fewer required facts</w:t>
             </w:r>
           </w:p>
         </w:tc>
@@ -10127,6 +10492,7 @@
               <w:rPr>
                 <w:sz w:val="14"/>
               </w:rPr>
+              <w:t>TQ3 failed stability</w:t>
             </w:r>
           </w:p>
         </w:tc>
@@ -10143,6 +10509,7 @@
               <w:rPr>
                 <w:sz w:val="14"/>
               </w:rPr>
+              <w:t>No precision bonus; response evidence controls the score</w:t>
             </w:r>
           </w:p>
         </w:tc>
@@ -10337,6 +10704,7 @@
               <w:rPr>
                 <w:sz w:val="14"/>
               </w:rPr>
+              <w:t>AH-F01</w:t>
             </w:r>
           </w:p>
         </w:tc>
@@ -10353,6 +10721,7 @@
               <w:rPr>
                 <w:sz w:val="14"/>
               </w:rPr>
+              <w:t>AH-B02</w:t>
             </w:r>
           </w:p>
         </w:tc>
@@ -10369,6 +10738,7 @@
               <w:rPr>
                 <w:sz w:val="14"/>
               </w:rPr>
+              <w:t>DEP</w:t>
             </w:r>
           </w:p>
         </w:tc>
@@ -10385,6 +10755,7 @@
               <w:rPr>
                 <w:sz w:val="14"/>
               </w:rPr>
+              <w:t>CMake and Ninja absent from PATH; machine-wide silent installer stalled</w:t>
             </w:r>
           </w:p>
         </w:tc>
@@ -10401,6 +10772,7 @@
               <w:rPr>
                 <w:sz w:val="14"/>
               </w:rPr>
+              <w:t>Missing user build tools and MSI stall</w:t>
             </w:r>
           </w:p>
         </w:tc>
@@ -10417,6 +10789,7 @@
               <w:rPr>
                 <w:sz w:val="14"/>
               </w:rPr>
+              <w:t>Stopped winget route; installed user-local CMake 4.4.0/Ninja 1.13.0 and verified versions</w:t>
             </w:r>
           </w:p>
         </w:tc>
@@ -10433,6 +10806,7 @@
               <w:rPr>
                 <w:sz w:val="14"/>
               </w:rPr>
+              <w:t>Yes</w:t>
             </w:r>
           </w:p>
         </w:tc>
@@ -10449,6 +10823,7 @@
               <w:rPr>
                 <w:sz w:val="14"/>
               </w:rPr>
+              <w:t>`experiments/raw-results/animehacker-tq3-0/2026-07-18/build-cpu/`</w:t>
             </w:r>
           </w:p>
         </w:tc>
@@ -10471,6 +10846,7 @@
               <w:rPr>
                 <w:sz w:val="14"/>
               </w:rPr>
+              <w:t>AH-F02</w:t>
             </w:r>
           </w:p>
         </w:tc>
@@ -10488,6 +10864,7 @@
               <w:rPr>
                 <w:sz w:val="14"/>
               </w:rPr>
+              <w:t>AH-B02</w:t>
             </w:r>
           </w:p>
         </w:tc>
@@ -10505,6 +10882,7 @@
               <w:rPr>
                 <w:sz w:val="14"/>
               </w:rPr>
+              <w:t>BF</w:t>
             </w:r>
           </w:p>
         </w:tc>
@@ -10522,6 +10900,7 @@
               <w:rPr>
                 <w:sz w:val="14"/>
               </w:rPr>
+              <w:t>First CMake invocation could not find MSVC because cmd expanded PATH before VsDevCmd updated it</w:t>
             </w:r>
           </w:p>
         </w:tc>
@@ -10539,6 +10918,7 @@
               <w:rPr>
                 <w:sz w:val="14"/>
               </w:rPr>
+              <w:t>Command expansion order erased compiler PATH entries</w:t>
             </w:r>
           </w:p>
         </w:tc>
@@ -10556,6 +10936,7 @@
               <w:rPr>
                 <w:sz w:val="14"/>
               </w:rPr>
+              <w:t>Prepend user tools before calling VsDevCmd; fresh configure detected MSVC 19.51</w:t>
             </w:r>
           </w:p>
         </w:tc>
@@ -10573,6 +10954,7 @@
               <w:rPr>
                 <w:sz w:val="14"/>
               </w:rPr>
+              <w:t>Yes</w:t>
             </w:r>
           </w:p>
         </w:tc>
@@ -10590,6 +10972,7 @@
               <w:rPr>
                 <w:sz w:val="14"/>
               </w:rPr>
+              <w:t>`experiments/raw-results/animehacker-tq3-0/2026-07-18/build-cpu/configure.log`; `configure-retry.log`</w:t>
             </w:r>
           </w:p>
         </w:tc>
@@ -10611,6 +10994,7 @@
               <w:rPr>
                 <w:sz w:val="14"/>
               </w:rPr>
+              <w:t>AH-F03</w:t>
             </w:r>
           </w:p>
         </w:tc>
@@ -10627,6 +11011,7 @@
               <w:rPr>
                 <w:sz w:val="14"/>
               </w:rPr>
+              <w:t>AH-B05</w:t>
             </w:r>
           </w:p>
         </w:tc>
@@ -10643,6 +11028,7 @@
               <w:rPr>
                 <w:sz w:val="14"/>
               </w:rPr>
+              <w:t>REPRO</w:t>
             </w:r>
           </w:p>
         </w:tc>
@@ -10659,6 +11045,7 @@
               <w:rPr>
                 <w:sz w:val="14"/>
               </w:rPr>
+              <w:t>Two quantization tests segfaulted on TQ3_0 and then one failed its numeric gate</w:t>
             </w:r>
           </w:p>
         </w:tc>
@@ -10675,6 +11062,7 @@
               <w:rPr>
                 <w:sz w:val="14"/>
               </w:rPr>
+              <w:t>Generic tests called absent optional vec-dot trait; new 3-bit type omitted from existing 3-bit RMSE category</w:t>
             </w:r>
           </w:p>
         </w:tc>
@@ -10691,6 +11079,7 @@
               <w:rPr>
                 <w:sz w:val="14"/>
               </w:rPr>
+              <w:t>Added test-only capability guards and mapped TQ3_0 to unchanged 0.0040 3-bit limit; full suite passed 40/40</w:t>
             </w:r>
           </w:p>
         </w:tc>
@@ -10707,6 +11096,7 @@
               <w:rPr>
                 <w:sz w:val="14"/>
               </w:rPr>
+              <w:t>Yes</w:t>
             </w:r>
           </w:p>
         </w:tc>
@@ -10723,6 +11113,7 @@
               <w:rPr>
                 <w:sz w:val="14"/>
               </w:rPr>
+              <w:t>`experiments/raw-results/animehacker-tq3-0/2026-07-18/build-cpu/test-capability-guard.patch`; `ctest-final.log`</w:t>
             </w:r>
           </w:p>
         </w:tc>
@@ -10745,6 +11136,7 @@
               <w:rPr>
                 <w:sz w:val="14"/>
               </w:rPr>
+              <w:t>AH-F04</w:t>
             </w:r>
           </w:p>
         </w:tc>
@@ -10762,6 +11154,7 @@
               <w:rPr>
                 <w:sz w:val="14"/>
               </w:rPr>
+              <w:t>AH-B05</w:t>
             </w:r>
           </w:p>
         </w:tc>
@@ -10779,6 +11172,7 @@
               <w:rPr>
                 <w:sz w:val="14"/>
               </w:rPr>
+              <w:t>REPRO</w:t>
             </w:r>
           </w:p>
         </w:tc>
@@ -10796,6 +11190,7 @@
               <w:rPr>
                 <w:sz w:val="14"/>
               </w:rPr>
+              <w:t>One controller invocation ran CTest from source root and found zero tests</w:t>
             </w:r>
           </w:p>
         </w:tc>
@@ -10813,6 +11208,7 @@
               <w:rPr>
                 <w:sz w:val="14"/>
               </w:rPr>
+              <w:t>Missing explicit test directory</w:t>
             </w:r>
           </w:p>
         </w:tc>
@@ -10830,6 +11226,7 @@
               <w:rPr>
                 <w:sz w:val="14"/>
               </w:rPr>
+              <w:t>Rejected invalid zero-test result; reran with `--test-dir build-cpu-controlled`, parsed exactly 40/40</w:t>
             </w:r>
           </w:p>
         </w:tc>
@@ -10847,6 +11244,7 @@
               <w:rPr>
                 <w:sz w:val="14"/>
               </w:rPr>
+              <w:t>Yes</w:t>
             </w:r>
           </w:p>
         </w:tc>
@@ -10864,6 +11262,877 @@
               <w:rPr>
                 <w:sz w:val="14"/>
               </w:rPr>
+              <w:t>`experiments/raw-results/animehacker-tq3-0/2026-07-18/build-cpu/ctest-final.log`</w:t>
+            </w:r>
+          </w:p>
+        </w:tc>
+      </w:tr>
+      <w:tr>
+        <w:trPr>
+          <w:cantSplit/>
+        </w:trPr>
+        <w:tc>
+          <w:tcPr>
+            <w:tcW w:type="dxa" w:w="1818"/>
+            <w:vAlign w:val="center"/>
+          </w:tcPr>
+          <w:p>
+            <w:pPr>
+              <w:spacing w:after="0"/>
+            </w:pPr>
+            <w:r>
+              <w:rPr>
+                <w:sz w:val="14"/>
+              </w:rPr>
+              <w:t>AH-F05</w:t>
+            </w:r>
+          </w:p>
+        </w:tc>
+        <w:tc>
+          <w:tcPr>
+            <w:tcW w:type="dxa" w:w="1818"/>
+            <w:vAlign w:val="center"/>
+          </w:tcPr>
+          <w:p>
+            <w:pPr>
+              <w:spacing w:after="0"/>
+            </w:pPr>
+            <w:r>
+              <w:rPr>
+                <w:sz w:val="14"/>
+              </w:rPr>
+              <w:t>AH-B06</w:t>
+            </w:r>
+          </w:p>
+        </w:tc>
+        <w:tc>
+          <w:tcPr>
+            <w:tcW w:type="dxa" w:w="1818"/>
+            <w:vAlign w:val="center"/>
+          </w:tcPr>
+          <w:p>
+            <w:pPr>
+              <w:spacing w:after="0"/>
+            </w:pPr>
+            <w:r>
+              <w:rPr>
+                <w:sz w:val="14"/>
+              </w:rPr>
+              <w:t>REPRO</w:t>
+            </w:r>
+          </w:p>
+        </w:tc>
+        <w:tc>
+          <w:tcPr>
+            <w:tcW w:type="dxa" w:w="1818"/>
+            <w:vAlign w:val="center"/>
+          </w:tcPr>
+          <w:p>
+            <w:pPr>
+              <w:spacing w:after="0"/>
+            </w:pPr>
+            <w:r>
+              <w:rPr>
+                <w:sz w:val="14"/>
+              </w:rPr>
+              <w:t>SYCL Level Zero tests aborted during teardown with device-lost errors</w:t>
+            </w:r>
+          </w:p>
+        </w:tc>
+        <w:tc>
+          <w:tcPr>
+            <w:tcW w:type="dxa" w:w="1818"/>
+            <w:vAlign w:val="center"/>
+          </w:tcPr>
+          <w:p>
+            <w:pPr>
+              <w:spacing w:after="0"/>
+            </w:pPr>
+            <w:r>
+              <w:rPr>
+                <w:sz w:val="14"/>
+              </w:rPr>
+              <w:t>Level Zero runtime instability on the installed Intel UHD driver</w:t>
+            </w:r>
+          </w:p>
+        </w:tc>
+        <w:tc>
+          <w:tcPr>
+            <w:tcW w:type="dxa" w:w="1818"/>
+            <w:vAlign w:val="center"/>
+          </w:tcPr>
+          <w:p>
+            <w:pPr>
+              <w:spacing w:after="0"/>
+            </w:pPr>
+            <w:r>
+              <w:rPr>
+                <w:sz w:val="14"/>
+              </w:rPr>
+              <w:t>Selected the independently inventoried OpenCL SYCL device; final terminal reconciliation is 40/40</w:t>
+            </w:r>
+          </w:p>
+        </w:tc>
+        <w:tc>
+          <w:tcPr>
+            <w:tcW w:type="dxa" w:w="1818"/>
+            <w:vAlign w:val="center"/>
+          </w:tcPr>
+          <w:p>
+            <w:pPr>
+              <w:spacing w:after="0"/>
+            </w:pPr>
+            <w:r>
+              <w:rPr>
+                <w:sz w:val="14"/>
+              </w:rPr>
+              <w:t>Yes</w:t>
+            </w:r>
+          </w:p>
+        </w:tc>
+        <w:tc>
+          <w:tcPr>
+            <w:tcW w:type="dxa" w:w="1818"/>
+            <w:vAlign w:val="center"/>
+          </w:tcPr>
+          <w:p>
+            <w:pPr>
+              <w:spacing w:after="0"/>
+            </w:pPr>
+            <w:r>
+              <w:rPr>
+                <w:sz w:val="14"/>
+              </w:rPr>
+              <w:t>`experiments/raw-results/animehacker-tq3-0/2026-07-18/build-sycl/device-level-zero.log`; `reconciliation.json`</w:t>
+            </w:r>
+          </w:p>
+        </w:tc>
+      </w:tr>
+      <w:tr>
+        <w:trPr>
+          <w:cantSplit/>
+        </w:trPr>
+        <w:tc>
+          <w:tcPr>
+            <w:tcW w:type="dxa" w:w="1818"/>
+            <w:vAlign w:val="center"/>
+            <w:shd w:fill="EAF2F8"/>
+          </w:tcPr>
+          <w:p>
+            <w:pPr>
+              <w:spacing w:after="0"/>
+            </w:pPr>
+            <w:r>
+              <w:rPr>
+                <w:sz w:val="14"/>
+              </w:rPr>
+              <w:t>AH-F06</w:t>
+            </w:r>
+          </w:p>
+        </w:tc>
+        <w:tc>
+          <w:tcPr>
+            <w:tcW w:type="dxa" w:w="1818"/>
+            <w:vAlign w:val="center"/>
+            <w:shd w:fill="EAF2F8"/>
+          </w:tcPr>
+          <w:p>
+            <w:pPr>
+              <w:spacing w:after="0"/>
+            </w:pPr>
+            <w:r>
+              <w:rPr>
+                <w:sz w:val="14"/>
+              </w:rPr>
+              <w:t>AH-B05</w:t>
+            </w:r>
+          </w:p>
+        </w:tc>
+        <w:tc>
+          <w:tcPr>
+            <w:tcW w:type="dxa" w:w="1818"/>
+            <w:vAlign w:val="center"/>
+            <w:shd w:fill="EAF2F8"/>
+          </w:tcPr>
+          <w:p>
+            <w:pPr>
+              <w:spacing w:after="0"/>
+            </w:pPr>
+            <w:r>
+              <w:rPr>
+                <w:sz w:val="14"/>
+              </w:rPr>
+              <w:t>REPRO</w:t>
+            </w:r>
+          </w:p>
+        </w:tc>
+        <w:tc>
+          <w:tcPr>
+            <w:tcW w:type="dxa" w:w="1818"/>
+            <w:vAlign w:val="center"/>
+            <w:shd w:fill="EAF2F8"/>
+          </w:tcPr>
+          <w:p>
+            <w:pPr>
+              <w:spacing w:after="0"/>
+            </w:pPr>
+            <w:r>
+              <w:rPr>
+                <w:sz w:val="14"/>
+              </w:rPr>
+              <w:t>SYCL F16 EXP backend cases returned invalid numeric results</w:t>
+            </w:r>
+          </w:p>
+        </w:tc>
+        <w:tc>
+          <w:tcPr>
+            <w:tcW w:type="dxa" w:w="1818"/>
+            <w:vAlign w:val="center"/>
+            <w:shd w:fill="EAF2F8"/>
+          </w:tcPr>
+          <w:p>
+            <w:pPr>
+              <w:spacing w:after="0"/>
+            </w:pPr>
+            <w:r>
+              <w:rPr>
+                <w:sz w:val="14"/>
+              </w:rPr>
+              <w:t>Backend declared unsupported behavior as supported</w:t>
+            </w:r>
+          </w:p>
+        </w:tc>
+        <w:tc>
+          <w:tcPr>
+            <w:tcW w:type="dxa" w:w="1818"/>
+            <w:vAlign w:val="center"/>
+            <w:shd w:fill="EAF2F8"/>
+          </w:tcPr>
+          <w:p>
+            <w:pPr>
+              <w:spacing w:after="0"/>
+            </w:pPr>
+            <w:r>
+              <w:rPr>
+                <w:sz w:val="14"/>
+              </w:rPr>
+              <w:t>Restricted SYCL EXP support to verified F32; targeted regression and terminal suite passed</w:t>
+            </w:r>
+          </w:p>
+        </w:tc>
+        <w:tc>
+          <w:tcPr>
+            <w:tcW w:type="dxa" w:w="1818"/>
+            <w:vAlign w:val="center"/>
+            <w:shd w:fill="EAF2F8"/>
+          </w:tcPr>
+          <w:p>
+            <w:pPr>
+              <w:spacing w:after="0"/>
+            </w:pPr>
+            <w:r>
+              <w:rPr>
+                <w:sz w:val="14"/>
+              </w:rPr>
+              <w:t>Yes</w:t>
+            </w:r>
+          </w:p>
+        </w:tc>
+        <w:tc>
+          <w:tcPr>
+            <w:tcW w:type="dxa" w:w="1818"/>
+            <w:vAlign w:val="center"/>
+            <w:shd w:fill="EAF2F8"/>
+          </w:tcPr>
+          <w:p>
+            <w:pPr>
+              <w:spacing w:after="0"/>
+            </w:pPr>
+            <w:r>
+              <w:rPr>
+                <w:sz w:val="14"/>
+              </w:rPr>
+              <w:t>`experiments/raw-results/animehacker-tq3-0/2026-07-18/build-sycl/backend-ops-minimal-final.log`; `campaign-fixes.patch`</w:t>
+            </w:r>
+          </w:p>
+        </w:tc>
+      </w:tr>
+      <w:tr>
+        <w:trPr>
+          <w:cantSplit/>
+        </w:trPr>
+        <w:tc>
+          <w:tcPr>
+            <w:tcW w:type="dxa" w:w="1818"/>
+            <w:vAlign w:val="center"/>
+          </w:tcPr>
+          <w:p>
+            <w:pPr>
+              <w:spacing w:after="0"/>
+            </w:pPr>
+            <w:r>
+              <w:rPr>
+                <w:sz w:val="14"/>
+              </w:rPr>
+              <w:t>AH-F07</w:t>
+            </w:r>
+          </w:p>
+        </w:tc>
+        <w:tc>
+          <w:tcPr>
+            <w:tcW w:type="dxa" w:w="1818"/>
+            <w:vAlign w:val="center"/>
+          </w:tcPr>
+          <w:p>
+            <w:pPr>
+              <w:spacing w:after="0"/>
+            </w:pPr>
+            <w:r>
+              <w:rPr>
+                <w:sz w:val="14"/>
+              </w:rPr>
+              <w:t>AH-B05</w:t>
+            </w:r>
+          </w:p>
+        </w:tc>
+        <w:tc>
+          <w:tcPr>
+            <w:tcW w:type="dxa" w:w="1818"/>
+            <w:vAlign w:val="center"/>
+          </w:tcPr>
+          <w:p>
+            <w:pPr>
+              <w:spacing w:after="0"/>
+            </w:pPr>
+            <w:r>
+              <w:rPr>
+                <w:sz w:val="14"/>
+              </w:rPr>
+              <w:t>REPRO</w:t>
+            </w:r>
+          </w:p>
+        </w:tc>
+        <w:tc>
+          <w:tcPr>
+            <w:tcW w:type="dxa" w:w="1818"/>
+            <w:vAlign w:val="center"/>
+          </w:tcPr>
+          <w:p>
+            <w:pPr>
+              <w:spacing w:after="0"/>
+            </w:pPr>
+            <w:r>
+              <w:rPr>
+                <w:sz w:val="14"/>
+              </w:rPr>
+              <w:t>Thread-safety test exhausted OpenCL resources when run immediately after exhaustive backend operations</w:t>
+            </w:r>
+          </w:p>
+        </w:tc>
+        <w:tc>
+          <w:tcPr>
+            <w:tcW w:type="dxa" w:w="1818"/>
+            <w:vAlign w:val="center"/>
+          </w:tcPr>
+          <w:p>
+            <w:pPr>
+              <w:spacing w:after="0"/>
+            </w:pPr>
+            <w:r>
+              <w:rPr>
+                <w:sz w:val="14"/>
+              </w:rPr>
+              <w:t>Integrated-GPU resource lifetime/order sensitivity</w:t>
+            </w:r>
+          </w:p>
+        </w:tc>
+        <w:tc>
+          <w:tcPr>
+            <w:tcW w:type="dxa" w:w="1818"/>
+            <w:vAlign w:val="center"/>
+          </w:tcPr>
+          <w:p>
+            <w:pPr>
+              <w:spacing w:after="0"/>
+            </w:pPr>
+            <w:r>
+              <w:rPr>
+                <w:sz w:val="14"/>
+              </w:rPr>
+              <w:t>Preserved failed attempt and reran the exact indexed test in isolation; terminal pass included in 40/40 reconciliation</w:t>
+            </w:r>
+          </w:p>
+        </w:tc>
+        <w:tc>
+          <w:tcPr>
+            <w:tcW w:type="dxa" w:w="1818"/>
+            <w:vAlign w:val="center"/>
+          </w:tcPr>
+          <w:p>
+            <w:pPr>
+              <w:spacing w:after="0"/>
+            </w:pPr>
+            <w:r>
+              <w:rPr>
+                <w:sz w:val="14"/>
+              </w:rPr>
+              <w:t>Yes</w:t>
+            </w:r>
+          </w:p>
+        </w:tc>
+        <w:tc>
+          <w:tcPr>
+            <w:tcW w:type="dxa" w:w="1818"/>
+            <w:vAlign w:val="center"/>
+          </w:tcPr>
+          <w:p>
+            <w:pPr>
+              <w:spacing w:after="0"/>
+            </w:pPr>
+            <w:r>
+              <w:rPr>
+                <w:sz w:val="14"/>
+              </w:rPr>
+              <w:t>`experiments/raw-results/animehacker-tq3-0/2026-07-18/build-sycl/thread-safety-minimal-final.log`; `thread-safety-exact-minimal-final.log`</w:t>
+            </w:r>
+          </w:p>
+        </w:tc>
+      </w:tr>
+      <w:tr>
+        <w:trPr>
+          <w:cantSplit/>
+        </w:trPr>
+        <w:tc>
+          <w:tcPr>
+            <w:tcW w:type="dxa" w:w="1818"/>
+            <w:vAlign w:val="center"/>
+            <w:shd w:fill="EAF2F8"/>
+          </w:tcPr>
+          <w:p>
+            <w:pPr>
+              <w:spacing w:after="0"/>
+            </w:pPr>
+            <w:r>
+              <w:rPr>
+                <w:sz w:val="14"/>
+              </w:rPr>
+              <w:t>AH-F08</w:t>
+            </w:r>
+          </w:p>
+        </w:tc>
+        <w:tc>
+          <w:tcPr>
+            <w:tcW w:type="dxa" w:w="1818"/>
+            <w:vAlign w:val="center"/>
+            <w:shd w:fill="EAF2F8"/>
+          </w:tcPr>
+          <w:p>
+            <w:pPr>
+              <w:spacing w:after="0"/>
+            </w:pPr>
+            <w:r>
+              <w:rPr>
+                <w:sz w:val="14"/>
+              </w:rPr>
+              <w:t>AH-06/AH-07</w:t>
+            </w:r>
+          </w:p>
+        </w:tc>
+        <w:tc>
+          <w:tcPr>
+            <w:tcW w:type="dxa" w:w="1818"/>
+            <w:vAlign w:val="center"/>
+            <w:shd w:fill="EAF2F8"/>
+          </w:tcPr>
+          <w:p>
+            <w:pPr>
+              <w:spacing w:after="0"/>
+            </w:pPr>
+            <w:r>
+              <w:rPr>
+                <w:sz w:val="14"/>
+              </w:rPr>
+              <w:t>SAFETY</w:t>
+            </w:r>
+          </w:p>
+        </w:tc>
+        <w:tc>
+          <w:tcPr>
+            <w:tcW w:type="dxa" w:w="1818"/>
+            <w:vAlign w:val="center"/>
+            <w:shd w:fill="EAF2F8"/>
+          </w:tcPr>
+          <w:p>
+            <w:pPr>
+              <w:spacing w:after="0"/>
+            </w:pPr>
+            <w:r>
+              <w:rPr>
+                <w:sz w:val="14"/>
+              </w:rPr>
+              <w:t>8B model loads crossed 3 GiB, 2.5 GiB and final 2 GiB emergency floors before a request</w:t>
+            </w:r>
+          </w:p>
+        </w:tc>
+        <w:tc>
+          <w:tcPr>
+            <w:tcW w:type="dxa" w:w="1818"/>
+            <w:vAlign w:val="center"/>
+            <w:shd w:fill="EAF2F8"/>
+          </w:tcPr>
+          <w:p>
+            <w:pPr>
+              <w:spacing w:after="0"/>
+            </w:pPr>
+            <w:r>
+              <w:rPr>
+                <w:sz w:val="14"/>
+              </w:rPr>
+              <w:t>16 GB system cannot preserve the controlled reserve with these 8B mappings</w:t>
+            </w:r>
+          </w:p>
+        </w:tc>
+        <w:tc>
+          <w:tcPr>
+            <w:tcW w:type="dxa" w:w="1818"/>
+            <w:vAlign w:val="center"/>
+            <w:shd w:fill="EAF2F8"/>
+          </w:tcPr>
+          <w:p>
+            <w:pPr>
+              <w:spacing w:after="0"/>
+            </w:pPr>
+            <w:r>
+              <w:rPr>
+                <w:sz w:val="14"/>
+              </w:rPr>
+              <w:t>Stopped and cleaned every process tree; classified both rows from measured gate evidence without unsafe lowering</w:t>
+            </w:r>
+          </w:p>
+        </w:tc>
+        <w:tc>
+          <w:tcPr>
+            <w:tcW w:type="dxa" w:w="1818"/>
+            <w:vAlign w:val="center"/>
+            <w:shd w:fill="EAF2F8"/>
+          </w:tcPr>
+          <w:p>
+            <w:pPr>
+              <w:spacing w:after="0"/>
+            </w:pPr>
+            <w:r>
+              <w:rPr>
+                <w:sz w:val="14"/>
+              </w:rPr>
+              <w:t>Yes - safety-classified</w:t>
+            </w:r>
+          </w:p>
+        </w:tc>
+        <w:tc>
+          <w:tcPr>
+            <w:tcW w:type="dxa" w:w="1818"/>
+            <w:vAlign w:val="center"/>
+            <w:shd w:fill="EAF2F8"/>
+          </w:tcPr>
+          <w:p>
+            <w:pPr>
+              <w:spacing w:after="0"/>
+            </w:pPr>
+            <w:r>
+              <w:rPr>
+                <w:sz w:val="14"/>
+              </w:rPr>
+              <w:t>`experiments/raw-results/animehacker-tq3-0/2026-07-18/runtime/AH-06/`; `AH-07/pilot/`</w:t>
+            </w:r>
+          </w:p>
+        </w:tc>
+      </w:tr>
+      <w:tr>
+        <w:trPr>
+          <w:cantSplit/>
+        </w:trPr>
+        <w:tc>
+          <w:tcPr>
+            <w:tcW w:type="dxa" w:w="1818"/>
+            <w:vAlign w:val="center"/>
+          </w:tcPr>
+          <w:p>
+            <w:pPr>
+              <w:spacing w:after="0"/>
+            </w:pPr>
+            <w:r>
+              <w:rPr>
+                <w:sz w:val="14"/>
+              </w:rPr>
+              <w:t>AH-F09</w:t>
+            </w:r>
+          </w:p>
+        </w:tc>
+        <w:tc>
+          <w:tcPr>
+            <w:tcW w:type="dxa" w:w="1818"/>
+            <w:vAlign w:val="center"/>
+          </w:tcPr>
+          <w:p>
+            <w:pPr>
+              <w:spacing w:after="0"/>
+            </w:pPr>
+            <w:r>
+              <w:rPr>
+                <w:sz w:val="14"/>
+              </w:rPr>
+              <w:t>AH-09/AH-10</w:t>
+            </w:r>
+          </w:p>
+        </w:tc>
+        <w:tc>
+          <w:tcPr>
+            <w:tcW w:type="dxa" w:w="1818"/>
+            <w:vAlign w:val="center"/>
+          </w:tcPr>
+          <w:p>
+            <w:pPr>
+              <w:spacing w:after="0"/>
+            </w:pPr>
+            <w:r>
+              <w:rPr>
+                <w:sz w:val="14"/>
+              </w:rPr>
+              <w:t>UNSUP</w:t>
+            </w:r>
+          </w:p>
+        </w:tc>
+        <w:tc>
+          <w:tcPr>
+            <w:tcW w:type="dxa" w:w="1818"/>
+            <w:vAlign w:val="center"/>
+          </w:tcPr>
+          <w:p>
+            <w:pPr>
+              <w:spacing w:after="0"/>
+            </w:pPr>
+            <w:r>
+              <w:rPr>
+                <w:sz w:val="14"/>
+              </w:rPr>
+              <w:t>SYCL TQ3 flash-on emitted a one-token invalid result; flash-off aborted in `mmvq.cpp:1149`</w:t>
+            </w:r>
+          </w:p>
+        </w:tc>
+        <w:tc>
+          <w:tcPr>
+            <w:tcW w:type="dxa" w:w="1818"/>
+            <w:vAlign w:val="center"/>
+          </w:tcPr>
+          <w:p>
+            <w:pPr>
+              <w:spacing w:after="0"/>
+            </w:pPr>
+            <w:r>
+              <w:rPr>
+                <w:sz w:val="14"/>
+              </w:rPr>
+              <w:t>TQ3 K/V attention dequantization is not usable on this SYCL route</w:t>
+            </w:r>
+          </w:p>
+        </w:tc>
+        <w:tc>
+          <w:tcPr>
+            <w:tcW w:type="dxa" w:w="1818"/>
+            <w:vAlign w:val="center"/>
+          </w:tcPr>
+          <w:p>
+            <w:pPr>
+              <w:spacing w:after="0"/>
+            </w:pPr>
+            <w:r>
+              <w:rPr>
+                <w:sz w:val="14"/>
+              </w:rPr>
+              <w:t>Rejected sentinel metrics; proved limitation with explicit flash-off and narrowed tensor placement; classified AH-09/AH-10 unsupported</w:t>
+            </w:r>
+          </w:p>
+        </w:tc>
+        <w:tc>
+          <w:tcPr>
+            <w:tcW w:type="dxa" w:w="1818"/>
+            <w:vAlign w:val="center"/>
+          </w:tcPr>
+          <w:p>
+            <w:pPr>
+              <w:spacing w:after="0"/>
+            </w:pPr>
+            <w:r>
+              <w:rPr>
+                <w:sz w:val="14"/>
+              </w:rPr>
+              <w:t>Yes - capability-classified</w:t>
+            </w:r>
+          </w:p>
+        </w:tc>
+        <w:tc>
+          <w:tcPr>
+            <w:tcW w:type="dxa" w:w="1818"/>
+            <w:vAlign w:val="center"/>
+          </w:tcPr>
+          <w:p>
+            <w:pPr>
+              <w:spacing w:after="0"/>
+            </w:pPr>
+            <w:r>
+              <w:rPr>
+                <w:sz w:val="14"/>
+              </w:rPr>
+              <w:t>`experiments/raw-results/animehacker-tq3-0/2026-07-18/runtime/AH-09-rejected-flash-env-only/`; `AH-09-rejected-explicit-flash-off-layer/`</w:t>
+            </w:r>
+          </w:p>
+        </w:tc>
+      </w:tr>
+      <w:tr>
+        <w:trPr>
+          <w:cantSplit/>
+        </w:trPr>
+        <w:tc>
+          <w:tcPr>
+            <w:tcW w:type="dxa" w:w="1818"/>
+            <w:vAlign w:val="center"/>
+            <w:shd w:fill="EAF2F8"/>
+          </w:tcPr>
+          <w:p>
+            <w:pPr>
+              <w:spacing w:after="0"/>
+            </w:pPr>
+            <w:r>
+              <w:rPr>
+                <w:sz w:val="14"/>
+              </w:rPr>
+              <w:t>AH-F10</w:t>
+            </w:r>
+          </w:p>
+        </w:tc>
+        <w:tc>
+          <w:tcPr>
+            <w:tcW w:type="dxa" w:w="1818"/>
+            <w:vAlign w:val="center"/>
+            <w:shd w:fill="EAF2F8"/>
+          </w:tcPr>
+          <w:p>
+            <w:pPr>
+              <w:spacing w:after="0"/>
+            </w:pPr>
+            <w:r>
+              <w:rPr>
+                <w:sz w:val="14"/>
+              </w:rPr>
+              <w:t>AH-04/P5</w:t>
+            </w:r>
+          </w:p>
+        </w:tc>
+        <w:tc>
+          <w:tcPr>
+            <w:tcW w:type="dxa" w:w="1818"/>
+            <w:vAlign w:val="center"/>
+            <w:shd w:fill="EAF2F8"/>
+          </w:tcPr>
+          <w:p>
+            <w:pPr>
+              <w:spacing w:after="0"/>
+            </w:pPr>
+            <w:r>
+              <w:rPr>
+                <w:sz w:val="14"/>
+              </w:rPr>
+              <w:t>QUAL</w:t>
+            </w:r>
+          </w:p>
+        </w:tc>
+        <w:tc>
+          <w:tcPr>
+            <w:tcW w:type="dxa" w:w="1818"/>
+            <w:vAlign w:val="center"/>
+            <w:shd w:fill="EAF2F8"/>
+          </w:tcPr>
+          <w:p>
+            <w:pPr>
+              <w:spacing w:after="0"/>
+            </w:pPr>
+            <w:r>
+              <w:rPr>
+                <w:sz w:val="14"/>
+              </w:rPr>
+              <w:t>First 16K long-context attempt reached the 900-second absolute deadline</w:t>
+            </w:r>
+          </w:p>
+        </w:tc>
+        <w:tc>
+          <w:tcPr>
+            <w:tcW w:type="dxa" w:w="1818"/>
+            <w:vAlign w:val="center"/>
+            <w:shd w:fill="EAF2F8"/>
+          </w:tcPr>
+          <w:p>
+            <w:pPr>
+              <w:spacing w:after="0"/>
+            </w:pPr>
+            <w:r>
+              <w:rPr>
+                <w:sz w:val="14"/>
+              </w:rPr>
+              <w:t>Q8_0 CPU prefill exceeded the initial bounded deadline</w:t>
+            </w:r>
+          </w:p>
+        </w:tc>
+        <w:tc>
+          <w:tcPr>
+            <w:tcW w:type="dxa" w:w="1818"/>
+            <w:vAlign w:val="center"/>
+            <w:shd w:fill="EAF2F8"/>
+          </w:tcPr>
+          <w:p>
+            <w:pPr>
+              <w:spacing w:after="0"/>
+            </w:pPr>
+            <w:r>
+              <w:rPr>
+                <w:sz w:val="14"/>
+              </w:rPr>
+              <w:t>Preserved empty-response hash and reran P5 only with a 1,800-second ceiling; completed in 1,024.6 seconds</w:t>
+            </w:r>
+          </w:p>
+        </w:tc>
+        <w:tc>
+          <w:tcPr>
+            <w:tcW w:type="dxa" w:w="1818"/>
+            <w:vAlign w:val="center"/>
+            <w:shd w:fill="EAF2F8"/>
+          </w:tcPr>
+          <w:p>
+            <w:pPr>
+              <w:spacing w:after="0"/>
+            </w:pPr>
+            <w:r>
+              <w:rPr>
+                <w:sz w:val="14"/>
+              </w:rPr>
+              <w:t>Yes</w:t>
+            </w:r>
+          </w:p>
+        </w:tc>
+        <w:tc>
+          <w:tcPr>
+            <w:tcW w:type="dxa" w:w="1818"/>
+            <w:vAlign w:val="center"/>
+            <w:shd w:fill="EAF2F8"/>
+          </w:tcPr>
+          <w:p>
+            <w:pPr>
+              <w:spacing w:after="0"/>
+            </w:pPr>
+            <w:r>
+              <w:rPr>
+                <w:sz w:val="14"/>
+              </w:rPr>
+              <w:t>`experiments/raw-results/animehacker-tq3-0/2026-07-18/quality/AH-04/P5-timeout-900.json`; `P5.json`</w:t>
             </w:r>
           </w:p>
         </w:tc>
@@ -10975,6 +12244,7 @@
               <w:rPr>
                 <w:sz w:val="14"/>
               </w:rPr>
+              <w:t>CPU TQ3_0 runtime validated; SYCL conversion/copy code exists but TQ3 attention runtime is unusable on the tested Intel OpenCL device; Vulkan TQ3 path is not source-proven</w:t>
             </w:r>
           </w:p>
         </w:tc>
@@ -11015,6 +12285,7 @@
               <w:rPr>
                 <w:sz w:val="14"/>
               </w:rPr>
+              <w:t>No - source/history audit finds 3-bit PolarQuant only; no QJL projection or residual-correction implementation</w:t>
             </w:r>
           </w:p>
         </w:tc>
@@ -11053,6 +12324,7 @@
               <w:rPr>
                 <w:sz w:val="14"/>
               </w:rPr>
+              <w:t>Passed on CPU at 4K: 70.00 MiB KV, 3574.63 MiB peak WS, 11.54 decode tok/s; harsh quality score 3.28 versus 6.39 F16 baseline</w:t>
             </w:r>
           </w:p>
         </w:tc>
@@ -11093,6 +12365,7 @@
               <w:rPr>
                 <w:sz w:val="14"/>
               </w:rPr>
+              <w:t>Safety-blocked before request at the final 2 GiB reserve; 140.00 MiB KV allocation and 8737.70 MiB pre-stop peak WS measured</w:t>
             </w:r>
           </w:p>
         </w:tc>
@@ -11131,6 +12404,7 @@
               <w:rPr>
                 <w:sz w:val="14"/>
               </w:rPr>
+              <w:t>Validated for Diagnostic 1B and Granite 3B; repository terminal tests 40/40</w:t>
             </w:r>
           </w:p>
         </w:tc>
@@ -11171,6 +12445,7 @@
               <w:rPr>
                 <w:sz w:val="14"/>
               </w:rPr>
+              <w:t>Standard SYCL partial passed with 1/41 layers and 16.31% mean GPU; TQ3 SYCL classified unsupported after invalid flash output and `mmvq.cpp:1149` abort</w:t>
             </w:r>
           </w:p>
         </w:tc>
@@ -11209,6 +12484,7 @@
               <w:rPr>
                 <w:sz w:val="14"/>
               </w:rPr>
+              <w:t>Diagnostic 1K KV: 26.00 to 5.69 MiB (-78.1%); Granite 3B 4K KV: Q8_0 170.00 to TQ3_0 70.00 MiB (-58.8%); memory benefit accompanies lower decode throughput</w:t>
             </w:r>
           </w:p>
         </w:tc>
@@ -11249,6 +12525,7 @@
               <w:rPr>
                 <w:sz w:val="14"/>
               </w:rPr>
+              <w:t>High for quantized-KV CPU experimentation and failure characterization; insufficient for production Intel GPU integration</w:t>
             </w:r>
           </w:p>
         </w:tc>
@@ -11287,6 +12564,7 @@
               <w:rPr>
                 <w:sz w:val="14"/>
               </w:rPr>
+              <w:t>High: fork is behind upstream, QJL claim is absent, CPU vec-dot traits are incomplete, and SYCL TQ3 attention requires kernel/runtime repair</w:t>
             </w:r>
           </w:p>
         </w:tc>
@@ -11327,6 +12605,7 @@
               <w:rPr>
                 <w:sz w:val="14"/>
               </w:rPr>
+              <w:t>Conditional research-only CPU candidate; reject current SYCL TQ3 route for application integration</w:t>
             </w:r>
           </w:p>
         </w:tc>
@@ -11365,6 +12644,7 @@
               <w:rPr>
                 <w:sz w:val="14"/>
               </w:rPr>
+              <w:t>CPU fallback experiment only after quality acceptance; standard SYCL remains a separate non-TQ baseline</w:t>
             </w:r>
           </w:p>
         </w:tc>
@@ -11405,6 +12685,7 @@
               <w:rPr>
                 <w:sz w:val="14"/>
               </w:rPr>
+              <w:t>`experiments/raw-results/animehacker-tq3-0/2026-07-18/`</w:t>
             </w:r>
           </w:p>
         </w:tc>
@@ -11443,6 +12724,7 @@
               <w:rPr>
                 <w:sz w:val="14"/>
               </w:rPr>
+              <w:t>Compression is substantial, but performance regresses and the Intel GPU path fails correctness/stability gates; precision labels receive no quality bonus</w:t>
             </w:r>
           </w:p>
         </w:tc>
@@ -11546,6 +12828,7 @@
               <w:rPr>
                 <w:sz w:val="14"/>
               </w:rPr>
+              <w:t>`experiments/raw-results/animehacker-tq3-0/2026-07-18/`</w:t>
             </w:r>
           </w:p>
         </w:tc>
@@ -11586,6 +12869,7 @@
               <w:rPr>
                 <w:sz w:val="14"/>
               </w:rPr>
+              <w:t>Not separately created; controlled evidence is stored directly with hashed artifacts in the repository</w:t>
             </w:r>
           </w:p>
         </w:tc>
@@ -11624,6 +12908,7 @@
               <w:rPr>
                 <w:sz w:val="14"/>
               </w:rPr>
+              <w:t>5bc5ed3bdc25003aa9f07422753a7b8d4f9190fc</w:t>
             </w:r>
           </w:p>
         </w:tc>
@@ -11664,6 +12949,7 @@
               <w:rPr>
                 <w:sz w:val="14"/>
               </w:rPr>
+              <w:t>5bc5ed3bdc25003aa9f07422753a7b8d4f9190fc (clean detached campaign checkout)</w:t>
             </w:r>
           </w:p>
         </w:tc>
@@ -11702,6 +12988,7 @@
               <w:rPr>
                 <w:sz w:val="14"/>
               </w:rPr>
+              <w:t>Intel UHD Graphics via `opencl:gpu`, driver 32.0.101.7076; Level Zero retained as rejected unstable evidence</w:t>
             </w:r>
           </w:p>
         </w:tc>
@@ -11742,6 +13029,7 @@
               <w:rPr>
                 <w:sz w:val="14"/>
               </w:rPr>
+              <w:t>AH-01-AH-05 and AH-08 have three valid samples; AH-06/AH-07 safety-classified; AH-09/AH-10 capability-classified</w:t>
             </w:r>
           </w:p>
         </w:tc>
@@ -11780,6 +13068,7 @@
               <w:rPr>
                 <w:sz w:val="14"/>
               </w:rPr>
+              <w:t>Frozen P1-P6 screen, deterministic gates first, harsh weighted rubric, no precision bonus; raw response and hash retained per runnable row</w:t>
             </w:r>
           </w:p>
         </w:tc>
@@ -11820,6 +13109,7 @@
               <w:rPr>
                 <w:sz w:val="14"/>
               </w:rPr>
+              <w:t>Peak working set includes mapped GGUF pages and is not interchangeable with private bytes; both are reported separately, with physical-RAM floors enforced</w:t>
             </w:r>
           </w:p>
         </w:tc>

</xml_diff>

<commit_message>
docs(testing): reconcile WB-03 recovery evidence
</commit_message>
<xml_diff>
--- a/docs/testing/workbooks/generated/03_animehacker_TQ3_0_Controlled_Retest_Workbook_v1.docx
+++ b/docs/testing/workbooks/generated/03_animehacker_TQ3_0_Controlled_Retest_Workbook_v1.docx
@@ -8,7 +8,7 @@
         <w:jc w:val="center"/>
       </w:pPr>
       <w:r>
-        <w:t>03 animehacker TQ3_0 Controlled Retest Workbook v1.3</w:t>
+        <w:t>03 animehacker TQ3_0 Controlled Retest Workbook v1.4</w:t>
       </w:r>
     </w:p>
     <w:p>
@@ -677,6 +677,130 @@
             <w:tcW w:type="dxa" w:w="2078"/>
             <w:vAlign w:val="center"/>
             <w:shd w:fill="EAF2F8"/>
+          </w:tcPr>
+          <w:p>
+            <w:pPr>
+              <w:spacing w:after="0"/>
+            </w:pPr>
+            <w:r>
+              <w:rPr>
+                <w:sz w:val="14"/>
+              </w:rPr>
+              <w:t>Superseded</w:t>
+            </w:r>
+          </w:p>
+        </w:tc>
+      </w:tr>
+      <w:tr>
+        <w:trPr>
+          <w:cantSplit/>
+        </w:trPr>
+        <w:tc>
+          <w:tcPr>
+            <w:tcW w:type="dxa" w:w="2078"/>
+            <w:vAlign w:val="center"/>
+          </w:tcPr>
+          <w:p>
+            <w:pPr>
+              <w:spacing w:after="0"/>
+            </w:pPr>
+            <w:r>
+              <w:rPr>
+                <w:sz w:val="14"/>
+              </w:rPr>
+              <w:t>1.4</w:t>
+            </w:r>
+          </w:p>
+        </w:tc>
+        <w:tc>
+          <w:tcPr>
+            <w:tcW w:type="dxa" w:w="2078"/>
+            <w:vAlign w:val="center"/>
+          </w:tcPr>
+          <w:p>
+            <w:pPr>
+              <w:spacing w:after="0"/>
+            </w:pPr>
+            <w:r>
+              <w:rPr>
+                <w:sz w:val="14"/>
+              </w:rPr>
+              <w:t>2026-07-18</w:t>
+            </w:r>
+          </w:p>
+        </w:tc>
+        <w:tc>
+          <w:tcPr>
+            <w:tcW w:type="dxa" w:w="2078"/>
+            <w:vAlign w:val="center"/>
+          </w:tcPr>
+          <w:p>
+            <w:pPr>
+              <w:spacing w:after="0"/>
+            </w:pPr>
+            <w:r>
+              <w:rPr>
+                <w:sz w:val="14"/>
+              </w:rPr>
+              <w:t>Student</w:t>
+            </w:r>
+          </w:p>
+        </w:tc>
+        <w:tc>
+          <w:tcPr>
+            <w:tcW w:type="dxa" w:w="2078"/>
+            <w:vAlign w:val="center"/>
+          </w:tcPr>
+          <w:p>
+            <w:pPr>
+              <w:spacing w:after="0"/>
+            </w:pPr>
+            <w:r>
+              <w:rPr>
+                <w:sz w:val="14"/>
+              </w:rPr>
+              <w:t>Accepted three AH-09 SYCL-partial samples with CPU-resident TQ3 KV, complete resource/utilization metrics and six hashed quality adjudications (mean 6.0583); safety-classified AH-10 from fresh schema-v2 process evidence at the unchanged 2048 MiB floor with no request or quality run.</w:t>
+            </w:r>
+          </w:p>
+        </w:tc>
+        <w:tc>
+          <w:tcPr>
+            <w:tcW w:type="dxa" w:w="2078"/>
+            <w:vAlign w:val="center"/>
+          </w:tcPr>
+          <w:p>
+            <w:pPr>
+              <w:spacing w:after="0"/>
+            </w:pPr>
+            <w:r>
+              <w:rPr>
+                <w:sz w:val="14"/>
+              </w:rPr>
+              <w:t>AH-09; AH-10; P1-P6</w:t>
+            </w:r>
+          </w:p>
+        </w:tc>
+        <w:tc>
+          <w:tcPr>
+            <w:tcW w:type="dxa" w:w="2078"/>
+            <w:vAlign w:val="center"/>
+          </w:tcPr>
+          <w:p>
+            <w:pPr>
+              <w:spacing w:after="0"/>
+            </w:pPr>
+            <w:r>
+              <w:rPr>
+                <w:sz w:val="14"/>
+              </w:rPr>
+              <w:t>testing/animehacker-tq3-formal-retest; Pending PR; Pending merge</w:t>
+            </w:r>
+          </w:p>
+        </w:tc>
+        <w:tc>
+          <w:tcPr>
+            <w:tcW w:type="dxa" w:w="2078"/>
+            <w:vAlign w:val="center"/>
           </w:tcPr>
           <w:p>
             <w:pPr>
@@ -772,7 +896,7 @@
         <w:spacing w:after="60"/>
       </w:pPr>
       <w:r>
-        <w:t>Controlled retest template v1.3. Historical results were removed from this working copy; the original source document is preserved under docs/testing/source-material/original-workbooks/.</w:t>
+        <w:t>Controlled retest template v1.4. Historical results were removed from this working copy; the original source document is preserved under docs/testing/source-material/original-workbooks/.</w:t>
       </w:r>
     </w:p>
     <w:p>
@@ -1364,7 +1488,7 @@
               <w:rPr>
                 <w:sz w:val="14"/>
               </w:rPr>
-              <w:t>Complete: 6 runnable rows passed runtime/quality evidence collection; 2 rows safety-classified; 2 rows capability-classified; zero unresolved failures</w:t>
+              <w:t>Complete: 7 runnable rows passed runtime/quality evidence collection; 3 rows safety-classified; zero unresolved failures</w:t>
             </w:r>
           </w:p>
         </w:tc>
@@ -3792,7 +3916,7 @@
               <w:rPr>
                 <w:sz w:val="14"/>
               </w:rPr>
-              <w:t>Unsupported after controlled runtime proof; resolved</w:t>
+              <w:t>Complete - 3 measured samples and P1-P6 quality; CPU KV with 1/41 layers offloaded</w:t>
             </w:r>
           </w:p>
         </w:tc>
@@ -3923,7 +4047,7 @@
               <w:rPr>
                 <w:sz w:val="14"/>
               </w:rPr>
-              <w:t>Unsupported by AH-09 kernel proof and 8B memory gate; resolved</w:t>
+              <w:t>Safety-classified at unchanged 2048 MiB floor; no request or quality run</w:t>
             </w:r>
           </w:p>
         </w:tc>
@@ -4695,7 +4819,7 @@
               <w:rPr>
                 <w:sz w:val="14"/>
               </w:rPr>
-              <w:t>No usable attention runtime on tested device</w:t>
+              <w:t>Yes with CPU-resident TQ3 KV and 1/41 layers offloaded</w:t>
             </w:r>
           </w:p>
         </w:tc>
@@ -4712,7 +4836,7 @@
               <w:rPr>
                 <w:sz w:val="14"/>
               </w:rPr>
-              <w:t>Investigated - AH-09; AH-10 classified from prerequisite proof</w:t>
+              <w:t>AH-09 measured; AH-10 safety-classified</w:t>
             </w:r>
           </w:p>
         </w:tc>
@@ -6459,7 +6583,7 @@
               <w:rPr>
                 <w:sz w:val="14"/>
               </w:rPr>
-              <w:t>Unsupported: TQ3 attention offload aborts in `mmvq.cpp:1149`; flash path emits one-token invalid output</w:t>
+              <w:t>1/41 layers offloaded; actual device classification remains CPU because KV and 40 layers stayed on CPU</w:t>
             </w:r>
           </w:p>
         </w:tc>
@@ -6476,7 +6600,7 @@
               <w:rPr>
                 <w:sz w:val="14"/>
               </w:rPr>
-              <w:t>CPU TQ3_0 KV allocation proven before abort</w:t>
+              <w:t>CPU TQ3_0 KV, 70.00 MiB</w:t>
             </w:r>
           </w:p>
         </w:tc>
@@ -6493,7 +6617,7 @@
               <w:rPr>
                 <w:sz w:val="14"/>
               </w:rPr>
-              <w:t>Yes; CPU-only AH-05 is the valid TQ3 route</w:t>
+              <w:t>Yes; this is partial placement, not full GPU acceleration</w:t>
             </w:r>
           </w:p>
         </w:tc>
@@ -6510,7 +6634,7 @@
               <w:rPr>
                 <w:sz w:val="14"/>
               </w:rPr>
-              <w:t>Rejected attempts measured only; not reported as performance</w:t>
+              <w:t>mean 63.14%; median 65.81%; peak 67.71%</w:t>
             </w:r>
           </w:p>
         </w:tc>
@@ -6527,7 +6651,7 @@
               <w:rPr>
                 <w:sz w:val="14"/>
               </w:rPr>
-              <w:t>Rejected attempts measured 4% before abort/invalid response</w:t>
+              <w:t>mean 12.61%; median 12.00%; peak 17.00%; 411.63 MiB peak shared process GPU memory</w:t>
             </w:r>
           </w:p>
         </w:tc>
@@ -6544,7 +6668,7 @@
               <w:rPr>
                 <w:sz w:val="14"/>
               </w:rPr>
-              <w:t>`experiments/raw-results/animehacker-tq3-0/2026-07-18/runtime/AH-09-rejected-flash-env-only/`; `AH-09-rejected-explicit-flash-off-layer/`</w:t>
+              <w:t>`experiments/raw-results/animehacker-tq3-0/2026-07-18/runtime-recovery/AH-09/summary.json`</w:t>
             </w:r>
           </w:p>
         </w:tc>
@@ -6585,7 +6709,7 @@
               <w:rPr>
                 <w:sz w:val="14"/>
               </w:rPr>
-              <w:t>GPU partial planned</w:t>
+              <w:t>GPU partial requested</w:t>
             </w:r>
           </w:p>
         </w:tc>
@@ -6603,7 +6727,7 @@
               <w:rPr>
                 <w:sz w:val="14"/>
               </w:rPr>
-              <w:t>Intel UHD Graphics</w:t>
+              <w:t>Intel UHD Graphics load attempted</w:t>
             </w:r>
           </w:p>
         </w:tc>
@@ -6639,7 +6763,7 @@
               <w:rPr>
                 <w:sz w:val="14"/>
               </w:rPr>
-              <w:t>Not launched: same TQ3 SYCL kernel is unsupported and 8B standard load crossed the memory gate</w:t>
+              <w:t>Pilot stopped before request when available RAM crossed the unchanged 2048 MiB floor</w:t>
             </w:r>
           </w:p>
         </w:tc>
@@ -6657,7 +6781,7 @@
               <w:rPr>
                 <w:sz w:val="14"/>
               </w:rPr>
-              <w:t>Not allocated because prerequisite capability failed</w:t>
+              <w:t>70.00 MiB KV observed before stop; placement not accepted as a completed run</w:t>
             </w:r>
           </w:p>
         </w:tc>
@@ -6675,7 +6799,7 @@
               <w:rPr>
                 <w:sz w:val="14"/>
               </w:rPr>
-              <w:t>CPU AH-07 remains the only potentially valid TQ3 route</w:t>
+              <w:t>Safety stop; no request-window utilization</w:t>
             </w:r>
           </w:p>
         </w:tc>
@@ -6693,7 +6817,7 @@
               <w:rPr>
                 <w:sz w:val="14"/>
               </w:rPr>
-              <w:t>Not measured because launch was prohibited by proven prerequisite</w:t>
+              <w:t>Not measured: stopped before request</w:t>
             </w:r>
           </w:p>
         </w:tc>
@@ -6711,7 +6835,7 @@
               <w:rPr>
                 <w:sz w:val="14"/>
               </w:rPr>
-              <w:t>Not measured because launch was prohibited by proven prerequisite</w:t>
+              <w:t>Not measured: stopped before request</w:t>
             </w:r>
           </w:p>
         </w:tc>
@@ -6729,7 +6853,7 @@
               <w:rPr>
                 <w:sz w:val="14"/>
               </w:rPr>
-              <w:t>AH-09 failure evidence plus `experiments/raw-results/animehacker-tq3-0/2026-07-18/runtime/AH-06/pilot-emergency-stop-2048/`</w:t>
+              <w:t>`experiments/raw-results/animehacker-tq3-0/2026-07-18/runtime-recovery/AH-10/` schema-v2 process evidence</w:t>
             </w:r>
           </w:p>
         </w:tc>
@@ -8959,7 +9083,7 @@
               <w:rPr>
                 <w:sz w:val="14"/>
               </w:rPr>
-              <w:t>SYCL partial</w:t>
+              <w:t>SYCL partial (-ngl 1)</w:t>
             </w:r>
           </w:p>
         </w:tc>
@@ -8993,7 +9117,7 @@
               <w:rPr>
                 <w:sz w:val="14"/>
               </w:rPr>
-              <w:t>Rejected attempt: 2880.77 peak WS</w:t>
+              <w:t>2891.66 peak WS; 1040.09 peak private</w:t>
             </w:r>
           </w:p>
         </w:tc>
@@ -9010,7 +9134,7 @@
               <w:rPr>
                 <w:sz w:val="14"/>
               </w:rPr>
-              <w:t>70.00 allocation proven</w:t>
+              <w:t>70.00</w:t>
             </w:r>
           </w:p>
         </w:tc>
@@ -9027,7 +9151,7 @@
               <w:rPr>
                 <w:sz w:val="14"/>
               </w:rPr>
-              <w:t>Rejected one-token response; not a valid TTFT result</w:t>
+              <w:t>491.00 median</w:t>
             </w:r>
           </w:p>
         </w:tc>
@@ -9044,7 +9168,7 @@
               <w:rPr>
                 <w:sz w:val="14"/>
               </w:rPr>
-              <w:t>Rejected 1-token sentinel; no valid throughput</w:t>
+              <w:t>12.11 median decode; 40.90 median prompt</w:t>
             </w:r>
           </w:p>
         </w:tc>
@@ -9061,7 +9185,7 @@
               <w:rPr>
                 <w:sz w:val="14"/>
               </w:rPr>
-              <w:t>Not scored: runnable prerequisite disproven</w:t>
+              <w:t>6.06</w:t>
             </w:r>
           </w:p>
         </w:tc>
@@ -9078,7 +9202,7 @@
               <w:rPr>
                 <w:sz w:val="14"/>
               </w:rPr>
-              <w:t>Unsupported after controlled proof; no unresolved failure</w:t>
+              <w:t>Runtime and quality passed; CPU-resident TQ3 KV and 1/41 layers offloaded</w:t>
             </w:r>
           </w:p>
         </w:tc>
@@ -9137,7 +9261,7 @@
               <w:rPr>
                 <w:sz w:val="14"/>
               </w:rPr>
-              <w:t>Q4_K_M GGUF</w:t>
+              <w:t>Q8_0 GGUF</w:t>
             </w:r>
           </w:p>
         </w:tc>
@@ -9191,7 +9315,7 @@
               <w:rPr>
                 <w:sz w:val="14"/>
               </w:rPr>
-              <w:t>SYCL partial planned</w:t>
+              <w:t>SYCL partial requested</w:t>
             </w:r>
           </w:p>
         </w:tc>
@@ -9227,7 +9351,7 @@
               <w:rPr>
                 <w:sz w:val="14"/>
               </w:rPr>
-              <w:t>Not measured: launch prohibited by AH-09 kernel proof and 8B gate</w:t>
+              <w:t>8119.41 peak WS; 1145.24 peak private before stop</w:t>
             </w:r>
           </w:p>
         </w:tc>
@@ -9245,7 +9369,7 @@
               <w:rPr>
                 <w:sz w:val="14"/>
               </w:rPr>
-              <w:t>Predicted allocation not reported as measurement</w:t>
+              <w:t>70.00 before stop</w:t>
             </w:r>
           </w:p>
         </w:tc>
@@ -9263,7 +9387,7 @@
               <w:rPr>
                 <w:sz w:val="14"/>
               </w:rPr>
-              <w:t>Not measured: prerequisite unsupported</w:t>
+              <w:t>Not measured: stopped before request</w:t>
             </w:r>
           </w:p>
         </w:tc>
@@ -9281,7 +9405,7 @@
               <w:rPr>
                 <w:sz w:val="14"/>
               </w:rPr>
-              <w:t>Not measured: prerequisite unsupported</w:t>
+              <w:t>Not measured: stopped before request</w:t>
             </w:r>
           </w:p>
         </w:tc>
@@ -9299,7 +9423,7 @@
               <w:rPr>
                 <w:sz w:val="14"/>
               </w:rPr>
-              <w:t>Not scored: prerequisite unsupported</w:t>
+              <w:t>Not scored: safety prerequisite blocked</w:t>
             </w:r>
           </w:p>
         </w:tc>
@@ -9317,7 +9441,7 @@
               <w:rPr>
                 <w:sz w:val="14"/>
               </w:rPr>
-              <w:t>Unsupported before launch; no unresolved failure</w:t>
+              <w:t>Safety-classified at unchanged 2048 MiB floor; cleanup verified</w:t>
             </w:r>
           </w:p>
         </w:tc>
@@ -10525,6 +10649,770 @@
         <w:pStyle w:val="Heading2"/>
       </w:pPr>
       <w:r>
+        <w:t>AH-09 recovered quality adjudication</w:t>
+      </w:r>
+    </w:p>
+    <w:tbl>
+      <w:tblPr>
+        <w:tblStyle w:val="TableGrid"/>
+        <w:tblW w:type="auto" w:w="0"/>
+        <w:tblLayout w:type="autofit"/>
+        <w:tblLook w:firstColumn="1" w:firstRow="1" w:lastColumn="0" w:lastRow="0" w:noHBand="0" w:noVBand="1" w:val="04A0"/>
+      </w:tblPr>
+      <w:tblGrid>
+        <w:gridCol w:w="2909"/>
+        <w:gridCol w:w="2909"/>
+        <w:gridCol w:w="2909"/>
+        <w:gridCol w:w="2909"/>
+        <w:gridCol w:w="2909"/>
+      </w:tblGrid>
+      <w:tr>
+        <w:trPr>
+          <w:cantSplit/>
+          <w:tblHeader w:val="true"/>
+        </w:trPr>
+        <w:tc>
+          <w:tcPr>
+            <w:tcW w:type="dxa" w:w="2909"/>
+            <w:shd w:fill="1F4E78"/>
+            <w:vAlign w:val="center"/>
+          </w:tcPr>
+          <w:p>
+            <w:r>
+              <w:rPr>
+                <w:b/>
+                <w:color w:val="FFFFFF"/>
+                <w:sz w:val="14"/>
+              </w:rPr>
+              <w:t>Prompt</w:t>
+            </w:r>
+          </w:p>
+        </w:tc>
+        <w:tc>
+          <w:tcPr>
+            <w:tcW w:type="dxa" w:w="2909"/>
+            <w:shd w:fill="1F4E78"/>
+            <w:vAlign w:val="center"/>
+          </w:tcPr>
+          <w:p>
+            <w:r>
+              <w:rPr>
+                <w:b/>
+                <w:color w:val="FFFFFF"/>
+                <w:sz w:val="14"/>
+              </w:rPr>
+              <w:t>Score /10</w:t>
+            </w:r>
+          </w:p>
+        </w:tc>
+        <w:tc>
+          <w:tcPr>
+            <w:tcW w:type="dxa" w:w="2909"/>
+            <w:shd w:fill="1F4E78"/>
+            <w:vAlign w:val="center"/>
+          </w:tcPr>
+          <w:p>
+            <w:r>
+              <w:rPr>
+                <w:b/>
+                <w:color w:val="FFFFFF"/>
+                <w:sz w:val="14"/>
+              </w:rPr>
+              <w:t>Deterministic result</w:t>
+            </w:r>
+          </w:p>
+        </w:tc>
+        <w:tc>
+          <w:tcPr>
+            <w:tcW w:type="dxa" w:w="2909"/>
+            <w:shd w:fill="1F4E78"/>
+            <w:vAlign w:val="center"/>
+          </w:tcPr>
+          <w:p>
+            <w:r>
+              <w:rPr>
+                <w:b/>
+                <w:color w:val="FFFFFF"/>
+                <w:sz w:val="14"/>
+              </w:rPr>
+              <w:t>Evidence hash</w:t>
+            </w:r>
+          </w:p>
+        </w:tc>
+        <w:tc>
+          <w:tcPr>
+            <w:tcW w:type="dxa" w:w="2909"/>
+            <w:shd w:fill="1F4E78"/>
+            <w:vAlign w:val="center"/>
+          </w:tcPr>
+          <w:p>
+            <w:r>
+              <w:rPr>
+                <w:b/>
+                <w:color w:val="FFFFFF"/>
+                <w:sz w:val="14"/>
+              </w:rPr>
+              <w:t>Note</w:t>
+            </w:r>
+          </w:p>
+        </w:tc>
+      </w:tr>
+      <w:tr>
+        <w:trPr>
+          <w:cantSplit/>
+        </w:trPr>
+        <w:tc>
+          <w:tcPr>
+            <w:tcW w:type="dxa" w:w="2909"/>
+            <w:vAlign w:val="center"/>
+          </w:tcPr>
+          <w:p>
+            <w:pPr>
+              <w:spacing w:after="0"/>
+            </w:pPr>
+            <w:r>
+              <w:rPr>
+                <w:sz w:val="14"/>
+              </w:rPr>
+              <w:t>P1</w:t>
+            </w:r>
+          </w:p>
+        </w:tc>
+        <w:tc>
+          <w:tcPr>
+            <w:tcW w:type="dxa" w:w="2909"/>
+            <w:vAlign w:val="center"/>
+          </w:tcPr>
+          <w:p>
+            <w:pPr>
+              <w:spacing w:after="0"/>
+            </w:pPr>
+            <w:r>
+              <w:rPr>
+                <w:sz w:val="14"/>
+              </w:rPr>
+              <w:t>4.00</w:t>
+            </w:r>
+          </w:p>
+        </w:tc>
+        <w:tc>
+          <w:tcPr>
+            <w:tcW w:type="dxa" w:w="2909"/>
+            <w:vAlign w:val="center"/>
+          </w:tcPr>
+          <w:p>
+            <w:pPr>
+              <w:spacing w:after="0"/>
+            </w:pPr>
+            <w:r>
+              <w:rPr>
+                <w:sz w:val="14"/>
+              </w:rPr>
+              <w:t>Fail</w:t>
+            </w:r>
+          </w:p>
+        </w:tc>
+        <w:tc>
+          <w:tcPr>
+            <w:tcW w:type="dxa" w:w="2909"/>
+            <w:vAlign w:val="center"/>
+          </w:tcPr>
+          <w:p>
+            <w:pPr>
+              <w:spacing w:after="0"/>
+            </w:pPr>
+            <w:r>
+              <w:rPr>
+                <w:sz w:val="14"/>
+              </w:rPr>
+              <w:t>5301df6d2025c9d86efbf01602c1979dae8b8d6d7c6102db38d1cb429f07e2c9</w:t>
+            </w:r>
+          </w:p>
+        </w:tc>
+        <w:tc>
+          <w:tcPr>
+            <w:tcW w:type="dxa" w:w="2909"/>
+            <w:vAlign w:val="center"/>
+          </w:tcPr>
+          <w:p>
+            <w:pPr>
+              <w:spacing w:after="0"/>
+            </w:pPr>
+            <w:r>
+              <w:rPr>
+                <w:sz w:val="14"/>
+              </w:rPr>
+              <w:t>Required semantic slots were not retained</w:t>
+            </w:r>
+          </w:p>
+        </w:tc>
+      </w:tr>
+      <w:tr>
+        <w:trPr>
+          <w:cantSplit/>
+        </w:trPr>
+        <w:tc>
+          <w:tcPr>
+            <w:tcW w:type="dxa" w:w="2909"/>
+            <w:vAlign w:val="center"/>
+            <w:shd w:fill="EAF2F8"/>
+          </w:tcPr>
+          <w:p>
+            <w:pPr>
+              <w:spacing w:after="0"/>
+            </w:pPr>
+            <w:r>
+              <w:rPr>
+                <w:sz w:val="14"/>
+              </w:rPr>
+              <w:t>P2</w:t>
+            </w:r>
+          </w:p>
+        </w:tc>
+        <w:tc>
+          <w:tcPr>
+            <w:tcW w:type="dxa" w:w="2909"/>
+            <w:vAlign w:val="center"/>
+            <w:shd w:fill="EAF2F8"/>
+          </w:tcPr>
+          <w:p>
+            <w:pPr>
+              <w:spacing w:after="0"/>
+            </w:pPr>
+            <w:r>
+              <w:rPr>
+                <w:sz w:val="14"/>
+              </w:rPr>
+              <w:t>8.35</w:t>
+            </w:r>
+          </w:p>
+        </w:tc>
+        <w:tc>
+          <w:tcPr>
+            <w:tcW w:type="dxa" w:w="2909"/>
+            <w:vAlign w:val="center"/>
+            <w:shd w:fill="EAF2F8"/>
+          </w:tcPr>
+          <w:p>
+            <w:pPr>
+              <w:spacing w:after="0"/>
+            </w:pPr>
+            <w:r>
+              <w:rPr>
+                <w:sz w:val="14"/>
+              </w:rPr>
+              <w:t>Pass</w:t>
+            </w:r>
+          </w:p>
+        </w:tc>
+        <w:tc>
+          <w:tcPr>
+            <w:tcW w:type="dxa" w:w="2909"/>
+            <w:vAlign w:val="center"/>
+            <w:shd w:fill="EAF2F8"/>
+          </w:tcPr>
+          <w:p>
+            <w:pPr>
+              <w:spacing w:after="0"/>
+            </w:pPr>
+            <w:r>
+              <w:rPr>
+                <w:sz w:val="14"/>
+              </w:rPr>
+              <w:t>0ddac73d955e51ab4e2af46db74551ae917e8f8ac17f23a3e447adbad0332b85</w:t>
+            </w:r>
+          </w:p>
+        </w:tc>
+        <w:tc>
+          <w:tcPr>
+            <w:tcW w:type="dxa" w:w="2909"/>
+            <w:vAlign w:val="center"/>
+            <w:shd w:fill="EAF2F8"/>
+          </w:tcPr>
+          <w:p>
+            <w:pPr>
+              <w:spacing w:after="0"/>
+            </w:pPr>
+            <w:r>
+              <w:rPr>
+                <w:sz w:val="14"/>
+              </w:rPr>
+              <w:t>Exact labelled structure passed</w:t>
+            </w:r>
+          </w:p>
+        </w:tc>
+      </w:tr>
+      <w:tr>
+        <w:trPr>
+          <w:cantSplit/>
+        </w:trPr>
+        <w:tc>
+          <w:tcPr>
+            <w:tcW w:type="dxa" w:w="2909"/>
+            <w:vAlign w:val="center"/>
+          </w:tcPr>
+          <w:p>
+            <w:pPr>
+              <w:spacing w:after="0"/>
+            </w:pPr>
+            <w:r>
+              <w:rPr>
+                <w:sz w:val="14"/>
+              </w:rPr>
+              <w:t>P3</w:t>
+            </w:r>
+          </w:p>
+        </w:tc>
+        <w:tc>
+          <w:tcPr>
+            <w:tcW w:type="dxa" w:w="2909"/>
+            <w:vAlign w:val="center"/>
+          </w:tcPr>
+          <w:p>
+            <w:pPr>
+              <w:spacing w:after="0"/>
+            </w:pPr>
+            <w:r>
+              <w:rPr>
+                <w:sz w:val="14"/>
+              </w:rPr>
+              <w:t>8.70</w:t>
+            </w:r>
+          </w:p>
+        </w:tc>
+        <w:tc>
+          <w:tcPr>
+            <w:tcW w:type="dxa" w:w="2909"/>
+            <w:vAlign w:val="center"/>
+          </w:tcPr>
+          <w:p>
+            <w:pPr>
+              <w:spacing w:after="0"/>
+            </w:pPr>
+            <w:r>
+              <w:rPr>
+                <w:sz w:val="14"/>
+              </w:rPr>
+              <w:t>Pass</w:t>
+            </w:r>
+          </w:p>
+        </w:tc>
+        <w:tc>
+          <w:tcPr>
+            <w:tcW w:type="dxa" w:w="2909"/>
+            <w:vAlign w:val="center"/>
+          </w:tcPr>
+          <w:p>
+            <w:pPr>
+              <w:spacing w:after="0"/>
+            </w:pPr>
+            <w:r>
+              <w:rPr>
+                <w:sz w:val="14"/>
+              </w:rPr>
+              <w:t>70bc9a0c03802c4a71ed664d39b072b6cd1e6018689ff70cc4efff631e9e5c98</w:t>
+            </w:r>
+          </w:p>
+        </w:tc>
+        <w:tc>
+          <w:tcPr>
+            <w:tcW w:type="dxa" w:w="2909"/>
+            <w:vAlign w:val="center"/>
+          </w:tcPr>
+          <w:p>
+            <w:pPr>
+              <w:spacing w:after="0"/>
+            </w:pPr>
+            <w:r>
+              <w:rPr>
+                <w:sz w:val="14"/>
+              </w:rPr>
+              <w:t>Exact JSON structure passed</w:t>
+            </w:r>
+          </w:p>
+        </w:tc>
+      </w:tr>
+      <w:tr>
+        <w:trPr>
+          <w:cantSplit/>
+        </w:trPr>
+        <w:tc>
+          <w:tcPr>
+            <w:tcW w:type="dxa" w:w="2909"/>
+            <w:vAlign w:val="center"/>
+            <w:shd w:fill="EAF2F8"/>
+          </w:tcPr>
+          <w:p>
+            <w:pPr>
+              <w:spacing w:after="0"/>
+            </w:pPr>
+            <w:r>
+              <w:rPr>
+                <w:sz w:val="14"/>
+              </w:rPr>
+              <w:t>P4</w:t>
+            </w:r>
+          </w:p>
+        </w:tc>
+        <w:tc>
+          <w:tcPr>
+            <w:tcW w:type="dxa" w:w="2909"/>
+            <w:vAlign w:val="center"/>
+            <w:shd w:fill="EAF2F8"/>
+          </w:tcPr>
+          <w:p>
+            <w:pPr>
+              <w:spacing w:after="0"/>
+            </w:pPr>
+            <w:r>
+              <w:rPr>
+                <w:sz w:val="14"/>
+              </w:rPr>
+              <w:t>4.00</w:t>
+            </w:r>
+          </w:p>
+        </w:tc>
+        <w:tc>
+          <w:tcPr>
+            <w:tcW w:type="dxa" w:w="2909"/>
+            <w:vAlign w:val="center"/>
+            <w:shd w:fill="EAF2F8"/>
+          </w:tcPr>
+          <w:p>
+            <w:pPr>
+              <w:spacing w:after="0"/>
+            </w:pPr>
+            <w:r>
+              <w:rPr>
+                <w:sz w:val="14"/>
+              </w:rPr>
+              <w:t>Fail</w:t>
+            </w:r>
+          </w:p>
+        </w:tc>
+        <w:tc>
+          <w:tcPr>
+            <w:tcW w:type="dxa" w:w="2909"/>
+            <w:vAlign w:val="center"/>
+            <w:shd w:fill="EAF2F8"/>
+          </w:tcPr>
+          <w:p>
+            <w:pPr>
+              <w:spacing w:after="0"/>
+            </w:pPr>
+            <w:r>
+              <w:rPr>
+                <w:sz w:val="14"/>
+              </w:rPr>
+              <w:t>8b808310880d35799378cdc1cec3262a72ddca960cef9d6de21972f66c1c6e85</w:t>
+            </w:r>
+          </w:p>
+        </w:tc>
+        <w:tc>
+          <w:tcPr>
+            <w:tcW w:type="dxa" w:w="2909"/>
+            <w:vAlign w:val="center"/>
+            <w:shd w:fill="EAF2F8"/>
+          </w:tcPr>
+          <w:p>
+            <w:pPr>
+              <w:spacing w:after="0"/>
+            </w:pPr>
+            <w:r>
+              <w:rPr>
+                <w:sz w:val="14"/>
+              </w:rPr>
+              <w:t>Required cache and TurboQuant facts were missing</w:t>
+            </w:r>
+          </w:p>
+        </w:tc>
+      </w:tr>
+      <w:tr>
+        <w:trPr>
+          <w:cantSplit/>
+        </w:trPr>
+        <w:tc>
+          <w:tcPr>
+            <w:tcW w:type="dxa" w:w="2909"/>
+            <w:vAlign w:val="center"/>
+          </w:tcPr>
+          <w:p>
+            <w:pPr>
+              <w:spacing w:after="0"/>
+            </w:pPr>
+            <w:r>
+              <w:rPr>
+                <w:sz w:val="14"/>
+              </w:rPr>
+              <w:t>P5</w:t>
+            </w:r>
+          </w:p>
+        </w:tc>
+        <w:tc>
+          <w:tcPr>
+            <w:tcW w:type="dxa" w:w="2909"/>
+            <w:vAlign w:val="center"/>
+          </w:tcPr>
+          <w:p>
+            <w:pPr>
+              <w:spacing w:after="0"/>
+            </w:pPr>
+            <w:r>
+              <w:rPr>
+                <w:sz w:val="14"/>
+              </w:rPr>
+              <w:t>1.30</w:t>
+            </w:r>
+          </w:p>
+        </w:tc>
+        <w:tc>
+          <w:tcPr>
+            <w:tcW w:type="dxa" w:w="2909"/>
+            <w:vAlign w:val="center"/>
+          </w:tcPr>
+          <w:p>
+            <w:pPr>
+              <w:spacing w:after="0"/>
+            </w:pPr>
+            <w:r>
+              <w:rPr>
+                <w:sz w:val="14"/>
+              </w:rPr>
+              <w:t>Fail</w:t>
+            </w:r>
+          </w:p>
+        </w:tc>
+        <w:tc>
+          <w:tcPr>
+            <w:tcW w:type="dxa" w:w="2909"/>
+            <w:vAlign w:val="center"/>
+          </w:tcPr>
+          <w:p>
+            <w:pPr>
+              <w:spacing w:after="0"/>
+            </w:pPr>
+            <w:r>
+              <w:rPr>
+                <w:sz w:val="14"/>
+              </w:rPr>
+              <w:t>824f2908f1a04296801a3f2c86103f2bc8eca36c7935bb93b0ce5eb085d23aec</w:t>
+            </w:r>
+          </w:p>
+        </w:tc>
+        <w:tc>
+          <w:tcPr>
+            <w:tcW w:type="dxa" w:w="2909"/>
+            <w:vAlign w:val="center"/>
+          </w:tcPr>
+          <w:p>
+            <w:pPr>
+              <w:spacing w:after="0"/>
+            </w:pPr>
+            <w:r>
+              <w:rPr>
+                <w:sz w:val="14"/>
+              </w:rPr>
+              <w:t>Wrong long-context marker</w:t>
+            </w:r>
+          </w:p>
+        </w:tc>
+      </w:tr>
+      <w:tr>
+        <w:trPr>
+          <w:cantSplit/>
+        </w:trPr>
+        <w:tc>
+          <w:tcPr>
+            <w:tcW w:type="dxa" w:w="2909"/>
+            <w:vAlign w:val="center"/>
+            <w:shd w:fill="EAF2F8"/>
+          </w:tcPr>
+          <w:p>
+            <w:pPr>
+              <w:spacing w:after="0"/>
+            </w:pPr>
+            <w:r>
+              <w:rPr>
+                <w:sz w:val="14"/>
+              </w:rPr>
+              <w:t>P6</w:t>
+            </w:r>
+          </w:p>
+        </w:tc>
+        <w:tc>
+          <w:tcPr>
+            <w:tcW w:type="dxa" w:w="2909"/>
+            <w:vAlign w:val="center"/>
+            <w:shd w:fill="EAF2F8"/>
+          </w:tcPr>
+          <w:p>
+            <w:pPr>
+              <w:spacing w:after="0"/>
+            </w:pPr>
+            <w:r>
+              <w:rPr>
+                <w:sz w:val="14"/>
+              </w:rPr>
+              <w:t>10.00</w:t>
+            </w:r>
+          </w:p>
+        </w:tc>
+        <w:tc>
+          <w:tcPr>
+            <w:tcW w:type="dxa" w:w="2909"/>
+            <w:vAlign w:val="center"/>
+            <w:shd w:fill="EAF2F8"/>
+          </w:tcPr>
+          <w:p>
+            <w:pPr>
+              <w:spacing w:after="0"/>
+            </w:pPr>
+            <w:r>
+              <w:rPr>
+                <w:sz w:val="14"/>
+              </w:rPr>
+              <w:t>Pass</w:t>
+            </w:r>
+          </w:p>
+        </w:tc>
+        <w:tc>
+          <w:tcPr>
+            <w:tcW w:type="dxa" w:w="2909"/>
+            <w:vAlign w:val="center"/>
+            <w:shd w:fill="EAF2F8"/>
+          </w:tcPr>
+          <w:p>
+            <w:pPr>
+              <w:spacing w:after="0"/>
+            </w:pPr>
+            <w:r>
+              <w:rPr>
+                <w:sz w:val="14"/>
+              </w:rPr>
+              <w:t>215dbcb32c4f1a1d61eedf623ed4800482e0c68b651e464352bdc4dee733871e</w:t>
+            </w:r>
+          </w:p>
+        </w:tc>
+        <w:tc>
+          <w:tcPr>
+            <w:tcW w:type="dxa" w:w="2909"/>
+            <w:vAlign w:val="center"/>
+            <w:shd w:fill="EAF2F8"/>
+          </w:tcPr>
+          <w:p>
+            <w:pPr>
+              <w:spacing w:after="0"/>
+            </w:pPr>
+            <w:r>
+              <w:rPr>
+                <w:sz w:val="14"/>
+              </w:rPr>
+              <w:t>Multi-turn stability passed</w:t>
+            </w:r>
+          </w:p>
+        </w:tc>
+      </w:tr>
+      <w:tr>
+        <w:trPr>
+          <w:cantSplit/>
+        </w:trPr>
+        <w:tc>
+          <w:tcPr>
+            <w:tcW w:type="dxa" w:w="2909"/>
+            <w:vAlign w:val="center"/>
+          </w:tcPr>
+          <w:p>
+            <w:pPr>
+              <w:spacing w:after="0"/>
+            </w:pPr>
+            <w:r>
+              <w:rPr>
+                <w:sz w:val="14"/>
+              </w:rPr>
+              <w:t>Mean</w:t>
+            </w:r>
+          </w:p>
+        </w:tc>
+        <w:tc>
+          <w:tcPr>
+            <w:tcW w:type="dxa" w:w="2909"/>
+            <w:vAlign w:val="center"/>
+          </w:tcPr>
+          <w:p>
+            <w:pPr>
+              <w:spacing w:after="0"/>
+            </w:pPr>
+            <w:r>
+              <w:rPr>
+                <w:sz w:val="14"/>
+              </w:rPr>
+              <w:t>6.0583</w:t>
+            </w:r>
+          </w:p>
+        </w:tc>
+        <w:tc>
+          <w:tcPr>
+            <w:tcW w:type="dxa" w:w="2909"/>
+            <w:vAlign w:val="center"/>
+          </w:tcPr>
+          <w:p>
+            <w:pPr>
+              <w:spacing w:after="0"/>
+            </w:pPr>
+            <w:r>
+              <w:rPr>
+                <w:sz w:val="14"/>
+              </w:rPr>
+              <w:t>Mixed</w:t>
+            </w:r>
+          </w:p>
+        </w:tc>
+        <w:tc>
+          <w:tcPr>
+            <w:tcW w:type="dxa" w:w="2909"/>
+            <w:vAlign w:val="center"/>
+          </w:tcPr>
+          <w:p>
+            <w:pPr>
+              <w:spacing w:after="0"/>
+            </w:pPr>
+            <w:r>
+              <w:rPr>
+                <w:sz w:val="14"/>
+              </w:rPr>
+              <w:t>Recorded per response above</w:t>
+            </w:r>
+          </w:p>
+        </w:tc>
+        <w:tc>
+          <w:tcPr>
+            <w:tcW w:type="dxa" w:w="2909"/>
+            <w:vAlign w:val="center"/>
+          </w:tcPr>
+          <w:p>
+            <w:pPr>
+              <w:spacing w:after="0"/>
+            </w:pPr>
+            <w:r>
+              <w:rPr>
+                <w:sz w:val="14"/>
+              </w:rPr>
+              <w:t>Harsh rubric; no precision bonus</w:t>
+            </w:r>
+          </w:p>
+        </w:tc>
+      </w:tr>
+    </w:tbl>
+    <w:p>
+      <w:pPr>
+        <w:spacing w:after="40"/>
+      </w:pPr>
+    </w:p>
+    <w:p>
+      <w:pPr>
+        <w:pStyle w:val="Heading2"/>
+      </w:pPr>
+      <w:r>
         <w:t>Failure log</w:t>
       </w:r>
     </w:p>
@@ -11881,7 +12769,7 @@
               <w:rPr>
                 <w:sz w:val="14"/>
               </w:rPr>
-              <w:t>AH-09/AH-10</w:t>
+              <w:t>AH-09</w:t>
             </w:r>
           </w:p>
         </w:tc>
@@ -11898,7 +12786,7 @@
               <w:rPr>
                 <w:sz w:val="14"/>
               </w:rPr>
-              <w:t>UNSUP</w:t>
+              <w:t>RECOVERY</w:t>
             </w:r>
           </w:p>
         </w:tc>
@@ -11915,7 +12803,7 @@
               <w:rPr>
                 <w:sz w:val="14"/>
               </w:rPr>
-              <w:t>SYCL TQ3 flash-on emitted a one-token invalid result; flash-off aborted in `mmvq.cpp:1149`</w:t>
+              <w:t>Initial SYCL TQ3 attempts produced invalid/aborted attention paths</w:t>
             </w:r>
           </w:p>
         </w:tc>
@@ -11932,7 +12820,7 @@
               <w:rPr>
                 <w:sz w:val="14"/>
               </w:rPr>
-              <w:t>TQ3 K/V attention dequantization is not usable on this SYCL route</w:t>
+              <w:t>Broad GPU placement was not viable; narrowed placement retained KV and 40/41 layers on CPU</w:t>
             </w:r>
           </w:p>
         </w:tc>
@@ -11949,7 +12837,7 @@
               <w:rPr>
                 <w:sz w:val="14"/>
               </w:rPr>
-              <w:t>Rejected sentinel metrics; proved limitation with explicit flash-off and narrowed tensor placement; classified AH-09/AH-10 unsupported</w:t>
+              <w:t>Recovered with controlled `-ngl 1` placement; accepted three samples and six quality records without claiming GPU-resident TQ3 cache</w:t>
             </w:r>
           </w:p>
         </w:tc>
@@ -11966,7 +12854,7 @@
               <w:rPr>
                 <w:sz w:val="14"/>
               </w:rPr>
-              <w:t>Yes - capability-classified</w:t>
+              <w:t>Yes - recovered with bounded partial placement</w:t>
             </w:r>
           </w:p>
         </w:tc>
@@ -11983,7 +12871,7 @@
               <w:rPr>
                 <w:sz w:val="14"/>
               </w:rPr>
-              <w:t>`experiments/raw-results/animehacker-tq3-0/2026-07-18/runtime/AH-09-rejected-flash-env-only/`; `AH-09-rejected-explicit-flash-off-layer/`</w:t>
+              <w:t>`experiments/raw-results/animehacker-tq3-0/2026-07-18/runtime-recovery/AH-09/`; `quality-recovery/AH-09/`</w:t>
             </w:r>
           </w:p>
         </w:tc>
@@ -12006,6 +12894,154 @@
               <w:rPr>
                 <w:sz w:val="14"/>
               </w:rPr>
+              <w:t>AH-F11</w:t>
+            </w:r>
+          </w:p>
+        </w:tc>
+        <w:tc>
+          <w:tcPr>
+            <w:tcW w:type="dxa" w:w="1818"/>
+            <w:vAlign w:val="center"/>
+            <w:shd w:fill="EAF2F8"/>
+          </w:tcPr>
+          <w:p>
+            <w:pPr>
+              <w:spacing w:after="0"/>
+            </w:pPr>
+            <w:r>
+              <w:rPr>
+                <w:sz w:val="14"/>
+              </w:rPr>
+              <w:t>AH-10</w:t>
+            </w:r>
+          </w:p>
+        </w:tc>
+        <w:tc>
+          <w:tcPr>
+            <w:tcW w:type="dxa" w:w="1818"/>
+            <w:vAlign w:val="center"/>
+            <w:shd w:fill="EAF2F8"/>
+          </w:tcPr>
+          <w:p>
+            <w:pPr>
+              <w:spacing w:after="0"/>
+            </w:pPr>
+            <w:r>
+              <w:rPr>
+                <w:sz w:val="14"/>
+              </w:rPr>
+              <w:t>SAFETY</w:t>
+            </w:r>
+          </w:p>
+        </w:tc>
+        <w:tc>
+          <w:tcPr>
+            <w:tcW w:type="dxa" w:w="1818"/>
+            <w:vAlign w:val="center"/>
+            <w:shd w:fill="EAF2F8"/>
+          </w:tcPr>
+          <w:p>
+            <w:pPr>
+              <w:spacing w:after="0"/>
+            </w:pPr>
+            <w:r>
+              <w:rPr>
+                <w:sz w:val="14"/>
+              </w:rPr>
+              <w:t>Guarded 8B SYCL pilot crossed the unchanged 2048 MiB available-RAM floor before request</w:t>
+            </w:r>
+          </w:p>
+        </w:tc>
+        <w:tc>
+          <w:tcPr>
+            <w:tcW w:type="dxa" w:w="1818"/>
+            <w:vAlign w:val="center"/>
+            <w:shd w:fill="EAF2F8"/>
+          </w:tcPr>
+          <w:p>
+            <w:pPr>
+              <w:spacing w:after="0"/>
+            </w:pPr>
+            <w:r>
+              <w:rPr>
+                <w:sz w:val="14"/>
+              </w:rPr>
+              <w:t>9.35 GB model mapping on a 16 GB shared-memory system exhausted the controlled reserve</w:t>
+            </w:r>
+          </w:p>
+        </w:tc>
+        <w:tc>
+          <w:tcPr>
+            <w:tcW w:type="dxa" w:w="1818"/>
+            <w:vAlign w:val="center"/>
+            <w:shd w:fill="EAF2F8"/>
+          </w:tcPr>
+          <w:p>
+            <w:pPr>
+              <w:spacing w:after="0"/>
+            </w:pPr>
+            <w:r>
+              <w:rPr>
+                <w:sz w:val="14"/>
+              </w:rPr>
+              <w:t>Controller stopped synchronously; schema-v2 preflight, wrapper and post-stop cleanup prove zero residual processes; no quality run</w:t>
+            </w:r>
+          </w:p>
+        </w:tc>
+        <w:tc>
+          <w:tcPr>
+            <w:tcW w:type="dxa" w:w="1818"/>
+            <w:vAlign w:val="center"/>
+            <w:shd w:fill="EAF2F8"/>
+          </w:tcPr>
+          <w:p>
+            <w:pPr>
+              <w:spacing w:after="0"/>
+            </w:pPr>
+            <w:r>
+              <w:rPr>
+                <w:sz w:val="14"/>
+              </w:rPr>
+              <w:t>Yes - safety-classified</w:t>
+            </w:r>
+          </w:p>
+        </w:tc>
+        <w:tc>
+          <w:tcPr>
+            <w:tcW w:type="dxa" w:w="1818"/>
+            <w:vAlign w:val="center"/>
+            <w:shd w:fill="EAF2F8"/>
+          </w:tcPr>
+          <w:p>
+            <w:pPr>
+              <w:spacing w:after="0"/>
+            </w:pPr>
+            <w:r>
+              <w:rPr>
+                <w:sz w:val="14"/>
+              </w:rPr>
+              <w:t>`experiments/raw-results/animehacker-tq3-0/2026-07-18/runtime-recovery/AH-10/`</w:t>
+            </w:r>
+          </w:p>
+        </w:tc>
+      </w:tr>
+      <w:tr>
+        <w:trPr>
+          <w:cantSplit/>
+        </w:trPr>
+        <w:tc>
+          <w:tcPr>
+            <w:tcW w:type="dxa" w:w="1818"/>
+            <w:vAlign w:val="center"/>
+          </w:tcPr>
+          <w:p>
+            <w:pPr>
+              <w:spacing w:after="0"/>
+            </w:pPr>
+            <w:r>
+              <w:rPr>
+                <w:sz w:val="14"/>
+              </w:rPr>
               <w:t>AH-F10</w:t>
             </w:r>
           </w:p>
@@ -12014,7 +13050,6 @@
           <w:tcPr>
             <w:tcW w:type="dxa" w:w="1818"/>
             <w:vAlign w:val="center"/>
-            <w:shd w:fill="EAF2F8"/>
           </w:tcPr>
           <w:p>
             <w:pPr>
@@ -12032,7 +13067,6 @@
           <w:tcPr>
             <w:tcW w:type="dxa" w:w="1818"/>
             <w:vAlign w:val="center"/>
-            <w:shd w:fill="EAF2F8"/>
           </w:tcPr>
           <w:p>
             <w:pPr>
@@ -12050,7 +13084,6 @@
           <w:tcPr>
             <w:tcW w:type="dxa" w:w="1818"/>
             <w:vAlign w:val="center"/>
-            <w:shd w:fill="EAF2F8"/>
           </w:tcPr>
           <w:p>
             <w:pPr>
@@ -12068,7 +13101,6 @@
           <w:tcPr>
             <w:tcW w:type="dxa" w:w="1818"/>
             <w:vAlign w:val="center"/>
-            <w:shd w:fill="EAF2F8"/>
           </w:tcPr>
           <w:p>
             <w:pPr>
@@ -12086,7 +13118,6 @@
           <w:tcPr>
             <w:tcW w:type="dxa" w:w="1818"/>
             <w:vAlign w:val="center"/>
-            <w:shd w:fill="EAF2F8"/>
           </w:tcPr>
           <w:p>
             <w:pPr>
@@ -12104,7 +13135,6 @@
           <w:tcPr>
             <w:tcW w:type="dxa" w:w="1818"/>
             <w:vAlign w:val="center"/>
-            <w:shd w:fill="EAF2F8"/>
           </w:tcPr>
           <w:p>
             <w:pPr>
@@ -12122,7 +13152,6 @@
           <w:tcPr>
             <w:tcW w:type="dxa" w:w="1818"/>
             <w:vAlign w:val="center"/>
-            <w:shd w:fill="EAF2F8"/>
           </w:tcPr>
           <w:p>
             <w:pPr>
@@ -12445,7 +13474,7 @@
               <w:rPr>
                 <w:sz w:val="14"/>
               </w:rPr>
-              <w:t>Standard SYCL partial passed with 1/41 layers and 16.31% mean GPU; TQ3 SYCL classified unsupported after invalid flash output and `mmvq.cpp:1149` abort</w:t>
+              <w:t>Standard SYCL partial passed; recovered TQ3 also completed with 1/41 layers and 12.61% mean GPU, while TQ3 KV and most compute remained on CPU</w:t>
             </w:r>
           </w:p>
         </w:tc>
@@ -12605,7 +13634,7 @@
               <w:rPr>
                 <w:sz w:val="14"/>
               </w:rPr>
-              <w:t>Conditional research-only CPU candidate; reject current SYCL TQ3 route for application integration</w:t>
+              <w:t>Conditional research comparator: CPU and bounded SYCL-partial evidence accepted; no full-GPU TQ3 acceleration claim</w:t>
             </w:r>
           </w:p>
         </w:tc>
@@ -12644,7 +13673,7 @@
               <w:rPr>
                 <w:sz w:val="14"/>
               </w:rPr>
-              <w:t>CPU fallback experiment only after quality acceptance; standard SYCL remains a separate non-TQ baseline</w:t>
+              <w:t>CPU-resident TQ3 cache experiment with limited SYCL layer offload only after quality acceptance; AH-10 remains safety-blocked</w:t>
             </w:r>
           </w:p>
         </w:tc>
@@ -12724,7 +13753,7 @@
               <w:rPr>
                 <w:sz w:val="14"/>
               </w:rPr>
-              <w:t>Compression is substantial, but performance regresses and the Intel GPU path fails correctness/stability gates; precision labels receive no quality bonus</w:t>
+              <w:t>Compression is substantial and AH-09 recovered, but placement is predominantly CPU and quality mean is 6.0583; precision labels receive no quality bonus</w:t>
             </w:r>
           </w:p>
         </w:tc>
@@ -13029,7 +14058,7 @@
               <w:rPr>
                 <w:sz w:val="14"/>
               </w:rPr>
-              <w:t>AH-01-AH-05 and AH-08 have three valid samples; AH-06/AH-07 safety-classified; AH-09/AH-10 capability-classified</w:t>
+              <w:t>AH-01-AH-05, AH-08 and AH-09 have three valid samples; AH-06/AH-07/AH-10 are safety-classified</w:t>
             </w:r>
           </w:p>
         </w:tc>
@@ -13068,7 +14097,7 @@
               <w:rPr>
                 <w:sz w:val="14"/>
               </w:rPr>
-              <w:t>Frozen P1-P6 screen, deterministic gates first, harsh weighted rubric, no precision bonus; raw response and hash retained per runnable row</w:t>
+              <w:t>Frozen P1-P6 screen, deterministic gates first, harsh weighted rubric, no precision bonus; AH-09 mean 6.0583 from six hashed recovery responses; AH-10 had no quality run</w:t>
             </w:r>
           </w:p>
         </w:tc>

</xml_diff>

<commit_message>
docs(testing): align WB-03 Level Zero evidence
</commit_message>
<xml_diff>
--- a/docs/testing/workbooks/generated/03_animehacker_TQ3_0_Controlled_Retest_Workbook_v1.docx
+++ b/docs/testing/workbooks/generated/03_animehacker_TQ3_0_Controlled_Retest_Workbook_v1.docx
@@ -8,7 +8,7 @@
         <w:jc w:val="center"/>
       </w:pPr>
       <w:r>
-        <w:t>03 animehacker TQ3_0 Controlled Retest Workbook v1.4</w:t>
+        <w:t>03 animehacker TQ3_0 Controlled Retest Workbook v1.5</w:t>
       </w:r>
     </w:p>
     <w:p>
@@ -801,6 +801,137 @@
           <w:tcPr>
             <w:tcW w:type="dxa" w:w="2078"/>
             <w:vAlign w:val="center"/>
+          </w:tcPr>
+          <w:p>
+            <w:pPr>
+              <w:spacing w:after="0"/>
+            </w:pPr>
+            <w:r>
+              <w:rPr>
+                <w:sz w:val="14"/>
+              </w:rPr>
+              <w:t>Superseded</w:t>
+            </w:r>
+          </w:p>
+        </w:tc>
+      </w:tr>
+      <w:tr>
+        <w:trPr>
+          <w:cantSplit/>
+        </w:trPr>
+        <w:tc>
+          <w:tcPr>
+            <w:tcW w:type="dxa" w:w="2078"/>
+            <w:vAlign w:val="center"/>
+            <w:shd w:fill="EAF2F8"/>
+          </w:tcPr>
+          <w:p>
+            <w:pPr>
+              <w:spacing w:after="0"/>
+            </w:pPr>
+            <w:r>
+              <w:rPr>
+                <w:sz w:val="14"/>
+              </w:rPr>
+              <w:t>1.5</w:t>
+            </w:r>
+          </w:p>
+        </w:tc>
+        <w:tc>
+          <w:tcPr>
+            <w:tcW w:type="dxa" w:w="2078"/>
+            <w:vAlign w:val="center"/>
+            <w:shd w:fill="EAF2F8"/>
+          </w:tcPr>
+          <w:p>
+            <w:pPr>
+              <w:spacing w:after="0"/>
+            </w:pPr>
+            <w:r>
+              <w:rPr>
+                <w:sz w:val="14"/>
+              </w:rPr>
+              <w:t>2026-07-18</w:t>
+            </w:r>
+          </w:p>
+        </w:tc>
+        <w:tc>
+          <w:tcPr>
+            <w:tcW w:type="dxa" w:w="2078"/>
+            <w:vAlign w:val="center"/>
+            <w:shd w:fill="EAF2F8"/>
+          </w:tcPr>
+          <w:p>
+            <w:pPr>
+              <w:spacing w:after="0"/>
+            </w:pPr>
+            <w:r>
+              <w:rPr>
+                <w:sz w:val="14"/>
+              </w:rPr>
+              <w:t>Student</w:t>
+            </w:r>
+          </w:p>
+        </w:tc>
+        <w:tc>
+          <w:tcPr>
+            <w:tcW w:type="dxa" w:w="2078"/>
+            <w:vAlign w:val="center"/>
+            <w:shd w:fill="EAF2F8"/>
+          </w:tcPr>
+          <w:p>
+            <w:pPr>
+              <w:spacing w:after="0"/>
+            </w:pPr>
+            <w:r>
+              <w:rPr>
+                <w:sz w:val="14"/>
+              </w:rPr>
+              <w:t>Corrected recovered AH-09/AH-10 backend labels to Level Zero level_zero:0 while preserving AH-08 OpenCL; aligned AH-10 terminal fields to the accepted final pilot measurement of 70.0 MiB KV and 8969.625 MiB peak working set.</w:t>
+            </w:r>
+          </w:p>
+        </w:tc>
+        <w:tc>
+          <w:tcPr>
+            <w:tcW w:type="dxa" w:w="2078"/>
+            <w:vAlign w:val="center"/>
+            <w:shd w:fill="EAF2F8"/>
+          </w:tcPr>
+          <w:p>
+            <w:pPr>
+              <w:spacing w:after="0"/>
+            </w:pPr>
+            <w:r>
+              <w:rPr>
+                <w:sz w:val="14"/>
+              </w:rPr>
+              <w:t>AH-09; AH-10</w:t>
+            </w:r>
+          </w:p>
+        </w:tc>
+        <w:tc>
+          <w:tcPr>
+            <w:tcW w:type="dxa" w:w="2078"/>
+            <w:vAlign w:val="center"/>
+            <w:shd w:fill="EAF2F8"/>
+          </w:tcPr>
+          <w:p>
+            <w:pPr>
+              <w:spacing w:after="0"/>
+            </w:pPr>
+            <w:r>
+              <w:rPr>
+                <w:sz w:val="14"/>
+              </w:rPr>
+              <w:t>testing/animehacker-tq3-formal-retest; Pending PR; Pending merge</w:t>
+            </w:r>
+          </w:p>
+        </w:tc>
+        <w:tc>
+          <w:tcPr>
+            <w:tcW w:type="dxa" w:w="2078"/>
+            <w:vAlign w:val="center"/>
+            <w:shd w:fill="EAF2F8"/>
           </w:tcPr>
           <w:p>
             <w:pPr>
@@ -896,7 +1027,7 @@
         <w:spacing w:after="60"/>
       </w:pPr>
       <w:r>
-        <w:t>Controlled retest template v1.4. Historical results were removed from this working copy; the original source document is preserved under docs/testing/source-material/original-workbooks/.</w:t>
+        <w:t>Controlled retest template v1.5. Historical results were removed from this working copy; the original source document is preserved under docs/testing/source-material/original-workbooks/.</w:t>
       </w:r>
     </w:p>
     <w:p>
@@ -1248,7 +1379,7 @@
               <w:rPr>
                 <w:sz w:val="14"/>
               </w:rPr>
-              <w:t>Controlled SYCL OpenCL build and reconciled 40/40 terminal tests passed; standard partial runtime passed; TQ3 SYCL runtime disproven; supplementary Vulkan built but has no TQ3_0-specific source evidence</w:t>
+              <w:t>Controlled SYCL build and reconciled 40/40 terminal tests passed; AH-08 standard partial runtime used OpenCL; recovered TQ3 rows used `ONEAPI_DEVICE_SELECTOR=level_zero:0`; supplementary Vulkan built but has no TQ3_0-specific source evidence</w:t>
             </w:r>
           </w:p>
         </w:tc>
@@ -2467,7 +2598,7 @@
               <w:rPr>
                 <w:sz w:val="14"/>
               </w:rPr>
-              <w:t>SYCL OpenCL device inventory succeeded; reconciled 40/40 terminal tests passed. Standard runtime offloaded 1/41 layers. TQ3 attention offload is runtime-unsupported. Supplementary Vulkan device exists but TQ3 is not source-proven. `experiments/raw-results/animehacker-tq3-0/2026-07-18/build-sycl/reconciliation.json`; `build-vulkan/reconciliation.json`</w:t>
+              <w:t>SYCL OpenCL inventory and tests supported the AH-08 standard baseline. Recovered AH-09 completed with Level Zero `level_zero:0`, CPU-resident TQ3 KV and 1/41 layers offloaded; AH-10 reached the safety floor on the same Level Zero route. Supplementary Vulkan exists but TQ3 is not source-proven. `experiments/raw-results/animehacker-tq3-0/2026-07-18/build-sycl/reconciliation.json`; `runtime-recovery/`; `build-vulkan/reconciliation.json`</w:t>
             </w:r>
           </w:p>
         </w:tc>
@@ -3865,7 +3996,7 @@
               <w:rPr>
                 <w:sz w:val="14"/>
               </w:rPr>
-              <w:t>SYCL partial</w:t>
+              <w:t>SYCL Level Zero `level_zero:0` partial</w:t>
             </w:r>
           </w:p>
         </w:tc>
@@ -3993,7 +4124,7 @@
               <w:rPr>
                 <w:sz w:val="14"/>
               </w:rPr>
-              <w:t>SYCL partial</w:t>
+              <w:t>SYCL Level Zero `level_zero:0` partial</w:t>
             </w:r>
           </w:p>
         </w:tc>
@@ -4047,7 +4178,7 @@
               <w:rPr>
                 <w:sz w:val="14"/>
               </w:rPr>
-              <w:t>Safety-classified at unchanged 2048 MiB floor; no request or quality run</w:t>
+              <w:t>Safety-classified at unchanged 2048 MiB floor; final pilot measured 70.0 MiB KV and 8969.625 MiB peak WS; no request or quality run</w:t>
             </w:r>
           </w:p>
         </w:tc>
@@ -4785,7 +4916,7 @@
               <w:rPr>
                 <w:sz w:val="14"/>
               </w:rPr>
-              <w:t>SYCL OpenCL partial</w:t>
+              <w:t>SYCL Level Zero `level_zero:0` partial</w:t>
             </w:r>
           </w:p>
         </w:tc>
@@ -6566,7 +6697,7 @@
               <w:rPr>
                 <w:sz w:val="14"/>
               </w:rPr>
-              <w:t>SYCL OpenCL</w:t>
+              <w:t>SYCL Level Zero `level_zero:0`</w:t>
             </w:r>
           </w:p>
         </w:tc>
@@ -6745,7 +6876,7 @@
               <w:rPr>
                 <w:sz w:val="14"/>
               </w:rPr>
-              <w:t>SYCL OpenCL</w:t>
+              <w:t>SYCL Level Zero `level_zero:0`</w:t>
             </w:r>
           </w:p>
         </w:tc>
@@ -6763,7 +6894,7 @@
               <w:rPr>
                 <w:sz w:val="14"/>
               </w:rPr>
-              <w:t>Pilot stopped before request when available RAM crossed the unchanged 2048 MiB floor</w:t>
+              <w:t>Final pilot stopped before request when available RAM crossed the unchanged 2048 MiB floor; 8969.625 MiB peak WS</w:t>
             </w:r>
           </w:p>
         </w:tc>
@@ -6781,7 +6912,7 @@
               <w:rPr>
                 <w:sz w:val="14"/>
               </w:rPr>
-              <w:t>70.00 MiB KV observed before stop; placement not accepted as a completed run</w:t>
+              <w:t>CPU TQ3_0 KV, 70.0 MiB before stop; placement not accepted as a completed run</w:t>
             </w:r>
           </w:p>
         </w:tc>
@@ -6853,7 +6984,7 @@
               <w:rPr>
                 <w:sz w:val="14"/>
               </w:rPr>
-              <w:t>`experiments/raw-results/animehacker-tq3-0/2026-07-18/runtime-recovery/AH-10/` schema-v2 process evidence</w:t>
+              <w:t>`experiments/raw-results/animehacker-tq3-0/2026-07-18/runtime-recovery/AH-10/pilot/measurement.json`; schema-v2 process evidence</w:t>
             </w:r>
           </w:p>
         </w:tc>
@@ -9083,7 +9214,7 @@
               <w:rPr>
                 <w:sz w:val="14"/>
               </w:rPr>
-              <w:t>SYCL partial (-ngl 1)</w:t>
+              <w:t>SYCL Level Zero `level_zero:0` partial (-ngl 1)</w:t>
             </w:r>
           </w:p>
         </w:tc>
@@ -9315,7 +9446,7 @@
               <w:rPr>
                 <w:sz w:val="14"/>
               </w:rPr>
-              <w:t>SYCL partial requested</w:t>
+              <w:t>SYCL Level Zero `level_zero:0` partial requested</w:t>
             </w:r>
           </w:p>
         </w:tc>
@@ -9351,7 +9482,7 @@
               <w:rPr>
                 <w:sz w:val="14"/>
               </w:rPr>
-              <w:t>8119.41 peak WS; 1145.24 peak private before stop</w:t>
+              <w:t>8969.625 MiB peak WS; 1145.535 MiB peak private before stop</w:t>
             </w:r>
           </w:p>
         </w:tc>
@@ -9369,7 +9500,7 @@
               <w:rPr>
                 <w:sz w:val="14"/>
               </w:rPr>
-              <w:t>70.00 before stop</w:t>
+              <w:t>70.0 MiB before stop</w:t>
             </w:r>
           </w:p>
         </w:tc>
@@ -9441,7 +9572,7 @@
               <w:rPr>
                 <w:sz w:val="14"/>
               </w:rPr>
-              <w:t>Safety-classified at unchanged 2048 MiB floor; cleanup verified</w:t>
+              <w:t>Final pilot safety-classified at unchanged 2048 MiB floor; cleanup verified</w:t>
             </w:r>
           </w:p>
         </w:tc>
@@ -13273,7 +13404,7 @@
               <w:rPr>
                 <w:sz w:val="14"/>
               </w:rPr>
-              <w:t>CPU TQ3_0 runtime validated; SYCL conversion/copy code exists but TQ3 attention runtime is unusable on the tested Intel OpenCL device; Vulkan TQ3 path is not source-proven</w:t>
+              <w:t>CPU TQ3_0 runtime validated; recovered SYCL TQ3 ran on Level Zero `level_zero:0` with CPU-resident KV and only 1/41 layers offloaded; Vulkan TQ3 path is not source-proven</w:t>
             </w:r>
           </w:p>
         </w:tc>
@@ -13394,7 +13525,7 @@
               <w:rPr>
                 <w:sz w:val="14"/>
               </w:rPr>
-              <w:t>Safety-blocked before request at the final 2 GiB reserve; 140.00 MiB KV allocation and 8737.70 MiB pre-stop peak WS measured</w:t>
+              <w:t>Final Level Zero `level_zero:0` pilot safety-blocked before request at the 2048 MiB reserve; 70.0 MiB KV and 8969.625 MiB peak WS measured in `runtime-recovery/AH-10/pilot/measurement.json`</w:t>
             </w:r>
           </w:p>
         </w:tc>
@@ -14017,7 +14148,7 @@
               <w:rPr>
                 <w:sz w:val="14"/>
               </w:rPr>
-              <w:t>Intel UHD Graphics via `opencl:gpu`, driver 32.0.101.7076; Level Zero retained as rejected unstable evidence</w:t>
+              <w:t>AH-08 standard-cache baseline used Intel UHD Graphics via `opencl:gpu`; recovered AH-09/AH-10 TQ3 evidence used `ONEAPI_DEVICE_SELECTOR=level_zero:0`. These routes are reported separately.</w:t>
             </w:r>
           </w:p>
         </w:tc>

</xml_diff>